<commit_message>
ra1(docx): volta a abrir cada capítulo numa página nova e tira o limite de páginas (#12)
</commit_message>
<xml_diff>
--- a/output/ra1-documentacao.docx
+++ b/output/ra1-documentacao.docx
@@ -163,7 +163,6 @@
     </w:p>
     <w:p>
       <w:pPr>
-        <w:keepNext/>
         <w:pageBreakBefore/>
       </w:pPr>
       <w:r>
@@ -1047,7 +1046,7 @@
     </w:p>
     <w:p>
       <w:pPr>
-        <w:keepNext/>
+        <w:pageBreakBefore/>
       </w:pPr>
       <w:r>
         <w:rPr>
@@ -2764,7 +2763,7 @@
     </w:p>
     <w:p>
       <w:pPr>
-        <w:keepNext/>
+        <w:pageBreakBefore/>
       </w:pPr>
       <w:r>
         <w:rPr>
@@ -8230,7 +8229,7 @@
     </w:p>
     <w:p>
       <w:pPr>
-        <w:keepNext/>
+        <w:pageBreakBefore/>
       </w:pPr>
       <w:r>
         <w:rPr>
@@ -9825,7 +9824,7 @@
     </w:p>
     <w:p>
       <w:pPr>
-        <w:keepNext/>
+        <w:pageBreakBefore/>
       </w:pPr>
       <w:r>
         <w:rPr>
@@ -11068,7 +11067,7 @@
     </w:p>
     <w:p>
       <w:pPr>
-        <w:keepNext/>
+        <w:pageBreakBefore/>
       </w:pPr>
       <w:r>
         <w:rPr>
@@ -12524,7 +12523,7 @@
     </w:p>
     <w:p>
       <w:pPr>
-        <w:keepNext/>
+        <w:pageBreakBefore/>
       </w:pPr>
       <w:r>
         <w:rPr>

</xml_diff>

<commit_message>
entrega: registra a execução final, gera o documento, o PDF do notebook e o PDF único (#14)
</commit_message>
<xml_diff>
--- a/output/ra1-documentacao.docx
+++ b/output/ra1-documentacao.docx
@@ -2868,7 +2868,7 @@
     <w:p>
       <w:pPr/>
       <w:r>
-        <w:t xml:space="preserve">Atributos usados pelas P1–P4, pelo RA2 e por este diagnóstico; os demais (URLs, capas, países, colaboradores) ficam no bruto. Os 102 atributos e suas ausências estão nas células “Visão geral e tipos observados” e “Ausências nulas e textos vazios”. Tipos do pandas 2.2.3; textos são </w:t>
+        <w:t xml:space="preserve">Atributos usados pelas P1–P4, pelo RA2 e por este diagnóstico; os demais (URLs, capas, países, colaboradores) ficam no bruto. Os 102 atributos e suas ausências estão nas células “Visão geral e tipos observados” e “Ausências nulas e textos vazios”. Tipos do pandas 2.3.3; textos são </w:t>
       </w:r>
       <w:r>
         <w:rPr>
@@ -9867,7 +9867,7 @@
       </w:r>
       <w:r>
         <w:rPr/>
-        <w:t>, CSV UTF-8, separador vírgula, sem coluna de índice: 2.800 registros, 16 atributos e 370.733 bytes. Evidência: notebook §5, célula "Gravação e releitura do conjunto preparado", e o próprio CSV.</w:t>
+        <w:t>, CSV UTF-8, separador vírgula, sem coluna de índice: 2.800 registros, 16 atributos e 367.932 bytes. Evidência: notebook §5, célula "Gravação e releitura do conjunto preparado", e o próprio CSV.</w:t>
       </w:r>
     </w:p>
     <w:p>
@@ -12500,25 +12500,59 @@
       </w:r>
     </w:p>
     <w:p>
-      <w:pPr>
-        <w:spacing w:after="160"/>
-      </w:pPr>
+      <w:pPr/>
+      <w:r>
+        <w:t xml:space="preserve">Em 20/10/2026, João Correa, que não escreveu o código das seções, seguiu os quatro passos acima a partir de um clone limpo: ambiente novo com </w:t>
+      </w:r>
       <w:r>
         <w:rPr>
-          <w:color w:val="606066"/>
+          <w:rFonts w:ascii="Consolas" w:hAnsi="Consolas"/>
+          <w:sz w:val="18"/>
         </w:rPr>
-        <w:t>[Registre a data, o responsável, o ambiente e o resultado de uma execução completa a partir das instruções acima.]</w:t>
-      </w:r>
-    </w:p>
-    <w:p>
-      <w:pPr>
-        <w:spacing w:after="80"/>
-        <w:pBdr>
-          <w:bottom w:val="single" w:sz="3" w:color="E2E2E2"/>
-        </w:pBdr>
-      </w:pPr>
-      <w:r>
-        <w:t xml:space="preserve"> </w:t>
+        <w:t>pip install -r requirements.txt</w:t>
+      </w:r>
+      <w:r>
+        <w:t xml:space="preserve"> e execução com </w:t>
+      </w:r>
+      <w:r>
+        <w:rPr>
+          <w:rFonts w:ascii="Consolas" w:hAnsi="Consolas"/>
+          <w:sz w:val="18"/>
+        </w:rPr>
+        <w:t>jupyter nbconvert --execute</w:t>
+      </w:r>
+      <w:r>
+        <w:t xml:space="preserve">, em Linux (WSL2), Python 3.13.5, pandas 2.3.3, requests 2.34.2, PySpark 4.0.3 e Java 21. Resultado: 47 células de código em sequência, sem erro, em 14 s; </w:t>
+      </w:r>
+      <w:r>
+        <w:rPr>
+          <w:rFonts w:ascii="Consolas" w:hAnsi="Consolas"/>
+          <w:sz w:val="18"/>
+        </w:rPr>
+        <w:t>df_bruto</w:t>
+      </w:r>
+      <w:r>
+        <w:t xml:space="preserve"> com 2.800 linhas × 102 colunas; </w:t>
+      </w:r>
+      <w:r>
+        <w:rPr>
+          <w:rFonts w:ascii="Consolas" w:hAnsi="Consolas"/>
+          <w:sz w:val="18"/>
+        </w:rPr>
+        <w:t>dados/preparados/faixas_preparadas.csv</w:t>
+      </w:r>
+      <w:r>
+        <w:t xml:space="preserve"> regravado idêntico ao versionado; três lotes de 30 eventos processados (90 reproduções); </w:t>
+      </w:r>
+      <w:r>
+        <w:rPr>
+          <w:rFonts w:ascii="Consolas" w:hAnsi="Consolas"/>
+          <w:sz w:val="18"/>
+        </w:rPr>
+        <w:t>python scripts/verificar_entrega.py</w:t>
+      </w:r>
+      <w:r>
+        <w:t xml:space="preserve"> sem pendência no notebook.</w:t>
       </w:r>
     </w:p>
     <w:p>
@@ -13067,7 +13101,7 @@
     </w:p>
     <w:p>
       <w:r>
-        <w:t>☐  Os campos-modelo foram preenchidos e os exemplos revisados.</w:t>
+        <w:t>☒  Os campos-modelo foram preenchidos e os exemplos revisados.</w:t>
       </w:r>
     </w:p>
     <w:sectPr>

</xml_diff>

<commit_message>
geral(entrega): segue a fonte e os fios do template no documento do RA1 (#14)
O código em linha sai na fonte do template (Calibri), sem a Consolas, e cada
subtítulo preenchido mantém o fio cinza que o fecha no template. Documento,
PDF do documento e PDF único gerados de novo.
</commit_message>
<xml_diff>
--- a/output/ra1-documentacao.docx
+++ b/output/ra1-documentacao.docx
@@ -203,6 +203,17 @@
     </w:p>
     <w:p>
       <w:pPr>
+        <w:spacing w:after="80"/>
+        <w:pBdr>
+          <w:bottom w:val="single" w:sz="3" w:color="E2E2E2"/>
+        </w:pBdr>
+      </w:pPr>
+      <w:r>
+        <w:t xml:space="preserve"> </w:t>
+      </w:r>
+    </w:p>
+    <w:p>
+      <w:pPr>
         <w:pStyle w:val="Heading2"/>
       </w:pPr>
       <w:r>
@@ -245,10 +256,6 @@
         <w:t xml:space="preserve"> a faixa (objeto </w:t>
       </w:r>
       <w:r>
-        <w:rPr>
-          <w:rFonts w:ascii="Consolas" w:hAnsi="Consolas"/>
-          <w:sz w:val="18"/>
-        </w:rPr>
         <w:t>track</w:t>
       </w:r>
       <w:r>
@@ -267,20 +274,12 @@
         <w:t xml:space="preserve"> as primeiras posições do chart geral e dos charts de cada gênero listado pela API (</w:t>
       </w:r>
       <w:r>
-        <w:rPr>
-          <w:rFonts w:ascii="Consolas" w:hAnsi="Consolas"/>
-          <w:sz w:val="18"/>
-        </w:rPr>
         <w:t>/genre</w:t>
       </w:r>
       <w:r>
         <w:t xml:space="preserve"> e </w:t>
       </w:r>
       <w:r>
-        <w:rPr>
-          <w:rFonts w:ascii="Consolas" w:hAnsi="Consolas"/>
-          <w:sz w:val="18"/>
-        </w:rPr>
         <w:t>/chart/{id_genero}/tracks</w:t>
       </w:r>
       <w:r>
@@ -299,24 +298,27 @@
         <w:t xml:space="preserve"> só faixas dos charts, não o catálogo inteiro; charts vistos a partir do país da coleta, registrado na seção 02; sem número de reproduções, só o </w:t>
       </w:r>
       <w:r>
-        <w:rPr>
-          <w:rFonts w:ascii="Consolas" w:hAnsi="Consolas"/>
-          <w:sz w:val="18"/>
-        </w:rPr>
         <w:t>rank</w:t>
       </w:r>
       <w:r>
         <w:t xml:space="preserve">, índice de popularidade calculado pela Deezer; atributos de áudio como </w:t>
       </w:r>
       <w:r>
-        <w:rPr>
-          <w:rFonts w:ascii="Consolas" w:hAnsi="Consolas"/>
-          <w:sz w:val="18"/>
-        </w:rPr>
         <w:t>bpm</w:t>
       </w:r>
       <w:r>
         <w:t xml:space="preserve"> ficam fora das perguntas, porque a API costuma devolvê-los zerados quando não os calculou.</w:t>
+      </w:r>
+    </w:p>
+    <w:p>
+      <w:pPr>
+        <w:spacing w:after="80"/>
+        <w:pBdr>
+          <w:bottom w:val="single" w:sz="3" w:color="E2E2E2"/>
+        </w:pBdr>
+      </w:pPr>
+      <w:r>
+        <w:t xml:space="preserve"> </w:t>
       </w:r>
     </w:p>
     <w:p>
@@ -504,7 +506,6 @@
             <w:r>
               <w:rPr>
                 <w:b w:val="0"/>
-                <w:rFonts w:ascii="Consolas" w:hAnsi="Consolas"/>
                 <w:sz w:val="18"/>
               </w:rPr>
               <w:t>duration</w:t>
@@ -519,7 +520,6 @@
             <w:r>
               <w:rPr>
                 <w:b w:val="0"/>
-                <w:rFonts w:ascii="Consolas" w:hAnsi="Consolas"/>
                 <w:sz w:val="18"/>
               </w:rPr>
               <w:t>/genre</w:t>
@@ -534,7 +534,6 @@
             <w:r>
               <w:rPr>
                 <w:b w:val="0"/>
-                <w:rFonts w:ascii="Consolas" w:hAnsi="Consolas"/>
                 <w:sz w:val="18"/>
               </w:rPr>
               <w:t>/chart/{id_genero}/tracks</w:t>
@@ -622,7 +621,6 @@
             <w:r>
               <w:rPr>
                 <w:b w:val="0"/>
-                <w:rFonts w:ascii="Consolas" w:hAnsi="Consolas"/>
                 <w:sz w:val="18"/>
               </w:rPr>
               <w:t>release_date</w:t>
@@ -637,7 +635,6 @@
             <w:r>
               <w:rPr>
                 <w:b w:val="0"/>
-                <w:rFonts w:ascii="Consolas" w:hAnsi="Consolas"/>
                 <w:sz w:val="18"/>
               </w:rPr>
               <w:t>/track/{id}</w:t>
@@ -707,7 +704,6 @@
             <w:r>
               <w:rPr>
                 <w:b w:val="0"/>
-                <w:rFonts w:ascii="Consolas" w:hAnsi="Consolas"/>
                 <w:sz w:val="18"/>
               </w:rPr>
               <w:t>rank</w:t>
@@ -740,7 +736,6 @@
             <w:r>
               <w:rPr>
                 <w:b w:val="0"/>
-                <w:rFonts w:ascii="Consolas" w:hAnsi="Consolas"/>
                 <w:sz w:val="18"/>
               </w:rPr>
               <w:t>rank</w:t>
@@ -755,7 +750,6 @@
             <w:r>
               <w:rPr>
                 <w:b w:val="0"/>
-                <w:rFonts w:ascii="Consolas" w:hAnsi="Consolas"/>
                 <w:sz w:val="18"/>
               </w:rPr>
               <w:t>nb_fan</w:t>
@@ -770,7 +764,6 @@
             <w:r>
               <w:rPr>
                 <w:b w:val="0"/>
-                <w:rFonts w:ascii="Consolas" w:hAnsi="Consolas"/>
                 <w:sz w:val="18"/>
               </w:rPr>
               <w:t>/artist/{id}</w:t>
@@ -858,7 +851,6 @@
             <w:r>
               <w:rPr>
                 <w:b w:val="0"/>
-                <w:rFonts w:ascii="Consolas" w:hAnsi="Consolas"/>
                 <w:sz w:val="18"/>
               </w:rPr>
               <w:t>artist.id</w:t>
@@ -873,7 +865,6 @@
             <w:r>
               <w:rPr>
                 <w:b w:val="0"/>
-                <w:rFonts w:ascii="Consolas" w:hAnsi="Consolas"/>
                 <w:sz w:val="18"/>
               </w:rPr>
               <w:t>position</w:t>
@@ -908,110 +899,66 @@
         <w:t xml:space="preserve">Todos os campos das perguntas existem na API pública da Deezer, sem autenticação: </w:t>
       </w:r>
       <w:r>
-        <w:rPr>
-          <w:rFonts w:ascii="Consolas" w:hAnsi="Consolas"/>
-          <w:sz w:val="18"/>
-        </w:rPr>
         <w:t>duration</w:t>
       </w:r>
       <w:r>
         <w:t xml:space="preserve">, </w:t>
       </w:r>
       <w:r>
-        <w:rPr>
-          <w:rFonts w:ascii="Consolas" w:hAnsi="Consolas"/>
-          <w:sz w:val="18"/>
-        </w:rPr>
         <w:t>rank</w:t>
       </w:r>
       <w:r>
         <w:t xml:space="preserve">, </w:t>
       </w:r>
       <w:r>
-        <w:rPr>
-          <w:rFonts w:ascii="Consolas" w:hAnsi="Consolas"/>
-          <w:sz w:val="18"/>
-        </w:rPr>
         <w:t>position</w:t>
       </w:r>
       <w:r>
         <w:t xml:space="preserve"> e </w:t>
       </w:r>
       <w:r>
-        <w:rPr>
-          <w:rFonts w:ascii="Consolas" w:hAnsi="Consolas"/>
-          <w:sz w:val="18"/>
-        </w:rPr>
         <w:t>artist.id</w:t>
       </w:r>
       <w:r>
         <w:t xml:space="preserve"> em </w:t>
       </w:r>
       <w:r>
-        <w:rPr>
-          <w:rFonts w:ascii="Consolas" w:hAnsi="Consolas"/>
-          <w:sz w:val="18"/>
-        </w:rPr>
         <w:t>/chart/{id_genero}/tracks</w:t>
       </w:r>
       <w:r>
         <w:t xml:space="preserve">, </w:t>
       </w:r>
       <w:r>
-        <w:rPr>
-          <w:rFonts w:ascii="Consolas" w:hAnsi="Consolas"/>
-          <w:sz w:val="18"/>
-        </w:rPr>
         <w:t>release_date</w:t>
       </w:r>
       <w:r>
         <w:t xml:space="preserve"> em </w:t>
       </w:r>
       <w:r>
-        <w:rPr>
-          <w:rFonts w:ascii="Consolas" w:hAnsi="Consolas"/>
-          <w:sz w:val="18"/>
-        </w:rPr>
         <w:t>/track/{id}</w:t>
       </w:r>
       <w:r>
         <w:t xml:space="preserve">, </w:t>
       </w:r>
       <w:r>
-        <w:rPr>
-          <w:rFonts w:ascii="Consolas" w:hAnsi="Consolas"/>
-          <w:sz w:val="18"/>
-        </w:rPr>
         <w:t>nb_fan</w:t>
       </w:r>
       <w:r>
         <w:t xml:space="preserve"> em </w:t>
       </w:r>
       <w:r>
-        <w:rPr>
-          <w:rFonts w:ascii="Consolas" w:hAnsi="Consolas"/>
-          <w:sz w:val="18"/>
-        </w:rPr>
         <w:t>/artist/{id}</w:t>
       </w:r>
       <w:r>
         <w:t xml:space="preserve"> e os gêneros em </w:t>
       </w:r>
       <w:r>
-        <w:rPr>
-          <w:rFonts w:ascii="Consolas" w:hAnsi="Consolas"/>
-          <w:sz w:val="18"/>
-        </w:rPr>
         <w:t>/genre</w:t>
       </w:r>
       <w:r>
         <w:t xml:space="preserve"> (fontes 1 e 2; </w:t>
       </w:r>
       <w:r>
-        <w:rPr>
-          <w:rFonts w:ascii="Consolas" w:hAnsi="Consolas"/>
-          <w:sz w:val="18"/>
-        </w:rPr>
         <w:t>base/api-deezer.md</w:t>
       </w:r>
       <w:r>
@@ -1024,24 +971,27 @@
         <w:t xml:space="preserve">Lacunas a confirmar na seção 03: a faixa pode estar no chart geral e no do seu gênero, e a deduplicação precisa preservar o gênero de origem; </w:t>
       </w:r>
       <w:r>
-        <w:rPr>
-          <w:rFonts w:ascii="Consolas" w:hAnsi="Consolas"/>
-          <w:sz w:val="18"/>
-        </w:rPr>
         <w:t>release_date</w:t>
       </w:r>
       <w:r>
         <w:t xml:space="preserve"> e </w:t>
       </w:r>
       <w:r>
-        <w:rPr>
-          <w:rFonts w:ascii="Consolas" w:hAnsi="Consolas"/>
-          <w:sz w:val="18"/>
-        </w:rPr>
         <w:t>nb_fan</w:t>
       </w:r>
       <w:r>
         <w:t xml:space="preserve"> podem vir ausentes ou zerados, reduzindo a base de P2 e P3; o gênero do chart, da Deezer, pode diferir do gênero do álbum; e um único retrato não mostra tendência.</w:t>
+      </w:r>
+    </w:p>
+    <w:p>
+      <w:pPr>
+        <w:spacing w:after="80"/>
+        <w:pBdr>
+          <w:bottom w:val="single" w:sz="3" w:color="E2E2E2"/>
+        </w:pBdr>
+      </w:pPr>
+      <w:r>
+        <w:t xml:space="preserve"> </w:t>
       </w:r>
     </w:p>
     <w:p>
@@ -1108,10 +1058,7 @@
         <w:t xml:space="preserve">Deezer • API pública </w:t>
       </w:r>
       <w:r>
-        <w:rPr>
-          <w:rFonts w:ascii="Consolas" w:hAnsi="Consolas"/>
-          <w:sz w:val="18"/>
-        </w:rPr>
+        <w:rPr/>
         <w:t>https://api.deezer.com</w:t>
       </w:r>
       <w:r>
@@ -1134,10 +1081,7 @@
         <w:t>JSON via API REST, gravado como recebido (57,7 MB no retrato de 16/10/2026) • 2.800 itens em 28 charts, com 2.581 faixas, 2.292 álbuns e 1.688 artistas únicos • atributos da faixa (</w:t>
       </w:r>
       <w:r>
-        <w:rPr>
-          <w:rFonts w:ascii="Consolas" w:hAnsi="Consolas"/>
-          <w:sz w:val="18"/>
-        </w:rPr>
+        <w:rPr/>
         <w:t>id</w:t>
       </w:r>
       <w:r>
@@ -1145,10 +1089,7 @@
         <w:t xml:space="preserve">, </w:t>
       </w:r>
       <w:r>
-        <w:rPr>
-          <w:rFonts w:ascii="Consolas" w:hAnsi="Consolas"/>
-          <w:sz w:val="18"/>
-        </w:rPr>
+        <w:rPr/>
         <w:t>title</w:t>
       </w:r>
       <w:r>
@@ -1156,10 +1097,7 @@
         <w:t xml:space="preserve">, </w:t>
       </w:r>
       <w:r>
-        <w:rPr>
-          <w:rFonts w:ascii="Consolas" w:hAnsi="Consolas"/>
-          <w:sz w:val="18"/>
-        </w:rPr>
+        <w:rPr/>
         <w:t>duration</w:t>
       </w:r>
       <w:r>
@@ -1167,10 +1105,7 @@
         <w:t xml:space="preserve">, </w:t>
       </w:r>
       <w:r>
-        <w:rPr>
-          <w:rFonts w:ascii="Consolas" w:hAnsi="Consolas"/>
-          <w:sz w:val="18"/>
-        </w:rPr>
+        <w:rPr/>
         <w:t>rank</w:t>
       </w:r>
       <w:r>
@@ -1178,10 +1113,7 @@
         <w:t xml:space="preserve">, </w:t>
       </w:r>
       <w:r>
-        <w:rPr>
-          <w:rFonts w:ascii="Consolas" w:hAnsi="Consolas"/>
-          <w:sz w:val="18"/>
-        </w:rPr>
+        <w:rPr/>
         <w:t>explicit_lyrics</w:t>
       </w:r>
       <w:r>
@@ -1189,10 +1121,7 @@
         <w:t xml:space="preserve">, </w:t>
       </w:r>
       <w:r>
-        <w:rPr>
-          <w:rFonts w:ascii="Consolas" w:hAnsi="Consolas"/>
-          <w:sz w:val="18"/>
-        </w:rPr>
+        <w:rPr/>
         <w:t>preview</w:t>
       </w:r>
       <w:r>
@@ -1200,10 +1129,7 @@
         <w:t xml:space="preserve">, </w:t>
       </w:r>
       <w:r>
-        <w:rPr>
-          <w:rFonts w:ascii="Consolas" w:hAnsi="Consolas"/>
-          <w:sz w:val="18"/>
-        </w:rPr>
+        <w:rPr/>
         <w:t>position</w:t>
       </w:r>
       <w:r>
@@ -1211,10 +1137,7 @@
         <w:t xml:space="preserve">, </w:t>
       </w:r>
       <w:r>
-        <w:rPr>
-          <w:rFonts w:ascii="Consolas" w:hAnsi="Consolas"/>
-          <w:sz w:val="18"/>
-        </w:rPr>
+        <w:rPr/>
         <w:t>bpm</w:t>
       </w:r>
       <w:r>
@@ -1222,10 +1145,7 @@
         <w:t xml:space="preserve">, </w:t>
       </w:r>
       <w:r>
-        <w:rPr>
-          <w:rFonts w:ascii="Consolas" w:hAnsi="Consolas"/>
-          <w:sz w:val="18"/>
-        </w:rPr>
+        <w:rPr/>
         <w:t>isrc</w:t>
       </w:r>
       <w:r>
@@ -1233,10 +1153,7 @@
         <w:t xml:space="preserve">, </w:t>
       </w:r>
       <w:r>
-        <w:rPr>
-          <w:rFonts w:ascii="Consolas" w:hAnsi="Consolas"/>
-          <w:sz w:val="18"/>
-        </w:rPr>
+        <w:rPr/>
         <w:t>release_date</w:t>
       </w:r>
       <w:r>
@@ -1244,10 +1161,7 @@
         <w:t>), do álbum (</w:t>
       </w:r>
       <w:r>
-        <w:rPr>
-          <w:rFonts w:ascii="Consolas" w:hAnsi="Consolas"/>
-          <w:sz w:val="18"/>
-        </w:rPr>
+        <w:rPr/>
         <w:t>genre_id</w:t>
       </w:r>
       <w:r>
@@ -1255,10 +1169,7 @@
         <w:t xml:space="preserve">, </w:t>
       </w:r>
       <w:r>
-        <w:rPr>
-          <w:rFonts w:ascii="Consolas" w:hAnsi="Consolas"/>
-          <w:sz w:val="18"/>
-        </w:rPr>
+        <w:rPr/>
         <w:t>genres</w:t>
       </w:r>
       <w:r>
@@ -1266,10 +1177,7 @@
         <w:t xml:space="preserve">, </w:t>
       </w:r>
       <w:r>
-        <w:rPr>
-          <w:rFonts w:ascii="Consolas" w:hAnsi="Consolas"/>
-          <w:sz w:val="18"/>
-        </w:rPr>
+        <w:rPr/>
         <w:t>label</w:t>
       </w:r>
       <w:r>
@@ -1277,10 +1185,7 @@
         <w:t xml:space="preserve">, </w:t>
       </w:r>
       <w:r>
-        <w:rPr>
-          <w:rFonts w:ascii="Consolas" w:hAnsi="Consolas"/>
-          <w:sz w:val="18"/>
-        </w:rPr>
+        <w:rPr/>
         <w:t>release_date</w:t>
       </w:r>
       <w:r>
@@ -1288,10 +1193,7 @@
         <w:t xml:space="preserve">, </w:t>
       </w:r>
       <w:r>
-        <w:rPr>
-          <w:rFonts w:ascii="Consolas" w:hAnsi="Consolas"/>
-          <w:sz w:val="18"/>
-        </w:rPr>
+        <w:rPr/>
         <w:t>record_type</w:t>
       </w:r>
       <w:r>
@@ -1299,10 +1201,7 @@
         <w:t xml:space="preserve">, </w:t>
       </w:r>
       <w:r>
-        <w:rPr>
-          <w:rFonts w:ascii="Consolas" w:hAnsi="Consolas"/>
-          <w:sz w:val="18"/>
-        </w:rPr>
+        <w:rPr/>
         <w:t>nb_tracks</w:t>
       </w:r>
       <w:r>
@@ -1310,10 +1209,7 @@
         <w:t>) e do artista (</w:t>
       </w:r>
       <w:r>
-        <w:rPr>
-          <w:rFonts w:ascii="Consolas" w:hAnsi="Consolas"/>
-          <w:sz w:val="18"/>
-        </w:rPr>
+        <w:rPr/>
         <w:t>name</w:t>
       </w:r>
       <w:r>
@@ -1321,10 +1217,7 @@
         <w:t xml:space="preserve">, </w:t>
       </w:r>
       <w:r>
-        <w:rPr>
-          <w:rFonts w:ascii="Consolas" w:hAnsi="Consolas"/>
-          <w:sz w:val="18"/>
-        </w:rPr>
+        <w:rPr/>
         <w:t>nb_fan</w:t>
       </w:r>
       <w:r>
@@ -1332,10 +1225,7 @@
         <w:t xml:space="preserve">, </w:t>
       </w:r>
       <w:r>
-        <w:rPr>
-          <w:rFonts w:ascii="Consolas" w:hAnsi="Consolas"/>
-          <w:sz w:val="18"/>
-        </w:rPr>
+        <w:rPr/>
         <w:t>nb_album</w:t>
       </w:r>
       <w:r>
@@ -1343,10 +1233,7 @@
         <w:t xml:space="preserve">); o </w:t>
       </w:r>
       <w:r>
-        <w:rPr>
-          <w:rFonts w:ascii="Consolas" w:hAnsi="Consolas"/>
-          <w:sz w:val="18"/>
-        </w:rPr>
+        <w:rPr/>
         <w:t>df_bruto</w:t>
       </w:r>
       <w:r>
@@ -1369,10 +1256,7 @@
         <w:t>charts do dia da coleta, sem histórico; cada um traz as 100 faixas mais populares no momento da requisição (</w:t>
       </w:r>
       <w:r>
-        <w:rPr>
-          <w:rFonts w:ascii="Consolas" w:hAnsi="Consolas"/>
-          <w:sz w:val="18"/>
-        </w:rPr>
+        <w:rPr/>
         <w:t>total</w:t>
       </w:r>
       <w:r>
@@ -1380,10 +1264,7 @@
         <w:t xml:space="preserve"> = 100 em todos) • país aparente: US (Estados Unidos) • charts: o geral (gênero 0) e os gêneros de </w:t>
       </w:r>
       <w:r>
-        <w:rPr>
-          <w:rFonts w:ascii="Consolas" w:hAnsi="Consolas"/>
-          <w:sz w:val="18"/>
-        </w:rPr>
+        <w:rPr/>
         <w:t>/genre</w:t>
       </w:r>
       <w:r>
@@ -1420,10 +1301,6 @@
         <w:t xml:space="preserve">Todos os campos das quatro perguntas (seção 01) vieram no retrato de 16/10/2026 e estão no </w:t>
       </w:r>
       <w:r>
-        <w:rPr>
-          <w:rFonts w:ascii="Consolas" w:hAnsi="Consolas"/>
-          <w:sz w:val="18"/>
-        </w:rPr>
         <w:t>df_bruto</w:t>
       </w:r>
       <w:r>
@@ -1444,30 +1321,18 @@
         <w:t xml:space="preserve"> (duração por gênero): </w:t>
       </w:r>
       <w:r>
-        <w:rPr>
-          <w:rFonts w:ascii="Consolas" w:hAnsi="Consolas"/>
-          <w:sz w:val="18"/>
-        </w:rPr>
         <w:t>duration</w:t>
       </w:r>
       <w:r>
         <w:t xml:space="preserve"> e o gênero do chart (</w:t>
       </w:r>
       <w:r>
-        <w:rPr>
-          <w:rFonts w:ascii="Consolas" w:hAnsi="Consolas"/>
-          <w:sz w:val="18"/>
-        </w:rPr>
         <w:t>chart_id_genero</w:t>
       </w:r>
       <w:r>
         <w:t xml:space="preserve">, </w:t>
       </w:r>
       <w:r>
-        <w:rPr>
-          <w:rFonts w:ascii="Consolas" w:hAnsi="Consolas"/>
-          <w:sz w:val="18"/>
-        </w:rPr>
         <w:t>chart_nome_genero</w:t>
       </w:r>
       <w:r>
@@ -1488,20 +1353,12 @@
         <w:t xml:space="preserve"> (lançamentos dos 12 meses anteriores à coleta, por gênero): </w:t>
       </w:r>
       <w:r>
-        <w:rPr>
-          <w:rFonts w:ascii="Consolas" w:hAnsi="Consolas"/>
-          <w:sz w:val="18"/>
-        </w:rPr>
         <w:t>detalhe_faixa_release_date</w:t>
       </w:r>
       <w:r>
         <w:t xml:space="preserve">, o gênero do chart e a data da coleta, no </w:t>
       </w:r>
       <w:r>
-        <w:rPr>
-          <w:rFonts w:ascii="Consolas" w:hAnsi="Consolas"/>
-          <w:sz w:val="18"/>
-        </w:rPr>
         <w:t>metadados.json</w:t>
       </w:r>
       <w:r>
@@ -1522,30 +1379,18 @@
         <w:t xml:space="preserve"> (fãs do artista e </w:t>
       </w:r>
       <w:r>
-        <w:rPr>
-          <w:rFonts w:ascii="Consolas" w:hAnsi="Consolas"/>
-          <w:sz w:val="18"/>
-        </w:rPr>
         <w:t>rank</w:t>
       </w:r>
       <w:r>
         <w:t xml:space="preserve">): </w:t>
       </w:r>
       <w:r>
-        <w:rPr>
-          <w:rFonts w:ascii="Consolas" w:hAnsi="Consolas"/>
-          <w:sz w:val="18"/>
-        </w:rPr>
         <w:t>rank</w:t>
       </w:r>
       <w:r>
         <w:t xml:space="preserve">, </w:t>
       </w:r>
       <w:r>
-        <w:rPr>
-          <w:rFonts w:ascii="Consolas" w:hAnsi="Consolas"/>
-          <w:sz w:val="18"/>
-        </w:rPr>
         <w:t>detalhe_artista_nb_fan</w:t>
       </w:r>
       <w:r>
@@ -1566,20 +1411,12 @@
         <w:t xml:space="preserve"> (concentração de artistas por chart): </w:t>
       </w:r>
       <w:r>
-        <w:rPr>
-          <w:rFonts w:ascii="Consolas" w:hAnsi="Consolas"/>
-          <w:sz w:val="18"/>
-        </w:rPr>
         <w:t>artist_id</w:t>
       </w:r>
       <w:r>
         <w:t xml:space="preserve">, </w:t>
       </w:r>
       <w:r>
-        <w:rPr>
-          <w:rFonts w:ascii="Consolas" w:hAnsi="Consolas"/>
-          <w:sz w:val="18"/>
-        </w:rPr>
         <w:t>position</w:t>
       </w:r>
       <w:r>
@@ -1590,6 +1427,17 @@
       <w:pPr/>
       <w:r>
         <w:t>Por ser de um único dia e país aparente (US), a fonte não apoia perguntas sobre evolução no tempo nem comparações entre países.</w:t>
+      </w:r>
+    </w:p>
+    <w:p>
+      <w:pPr>
+        <w:spacing w:after="80"/>
+        <w:pBdr>
+          <w:bottom w:val="single" w:sz="3" w:color="E2E2E2"/>
+        </w:pBdr>
+      </w:pPr>
+      <w:r>
+        <w:t xml:space="preserve"> </w:t>
       </w:r>
     </w:p>
     <w:p>
@@ -1759,7 +1607,6 @@
             <w:r>
               <w:rPr>
                 <w:b w:val="0"/>
-                <w:rFonts w:ascii="Consolas" w:hAnsi="Consolas"/>
                 <w:sz w:val="18"/>
               </w:rPr>
               <w:t>GET</w:t>
@@ -1774,7 +1621,6 @@
             <w:r>
               <w:rPr>
                 <w:b w:val="0"/>
-                <w:rFonts w:ascii="Consolas" w:hAnsi="Consolas"/>
                 <w:sz w:val="18"/>
               </w:rPr>
               <w:t>https://api.deezer.com</w:t>
@@ -1789,7 +1635,6 @@
             <w:r>
               <w:rPr>
                 <w:b w:val="0"/>
-                <w:rFonts w:ascii="Consolas" w:hAnsi="Consolas"/>
                 <w:sz w:val="18"/>
               </w:rPr>
               <w:t>error</w:t>
@@ -1884,7 +1729,6 @@
             <w:r>
               <w:rPr>
                 <w:b w:val="0"/>
-                <w:rFonts w:ascii="Consolas" w:hAnsi="Consolas"/>
                 <w:sz w:val="18"/>
               </w:rPr>
               <w:t>/genre</w:t>
@@ -1899,7 +1743,6 @@
             <w:r>
               <w:rPr>
                 <w:b w:val="0"/>
-                <w:rFonts w:ascii="Consolas" w:hAnsi="Consolas"/>
                 <w:sz w:val="18"/>
               </w:rPr>
               <w:t>/chart/{id}/tracks</w:t>
@@ -1914,7 +1757,6 @@
             <w:r>
               <w:rPr>
                 <w:b w:val="0"/>
-                <w:rFonts w:ascii="Consolas" w:hAnsi="Consolas"/>
                 <w:sz w:val="18"/>
               </w:rPr>
               <w:t>index</w:t>
@@ -1929,7 +1771,6 @@
             <w:r>
               <w:rPr>
                 <w:b w:val="0"/>
-                <w:rFonts w:ascii="Consolas" w:hAnsi="Consolas"/>
                 <w:sz w:val="18"/>
               </w:rPr>
               <w:t>limit=100</w:t>
@@ -1944,7 +1785,6 @@
             <w:r>
               <w:rPr>
                 <w:b w:val="0"/>
-                <w:rFonts w:ascii="Consolas" w:hAnsi="Consolas"/>
                 <w:sz w:val="18"/>
               </w:rPr>
               <w:t>/infos</w:t>
@@ -2039,7 +1879,6 @@
             <w:r>
               <w:rPr>
                 <w:b w:val="0"/>
-                <w:rFonts w:ascii="Consolas" w:hAnsi="Consolas"/>
                 <w:sz w:val="18"/>
               </w:rPr>
               <w:t>/track/{id}</w:t>
@@ -2054,7 +1893,6 @@
             <w:r>
               <w:rPr>
                 <w:b w:val="0"/>
-                <w:rFonts w:ascii="Consolas" w:hAnsi="Consolas"/>
                 <w:sz w:val="18"/>
               </w:rPr>
               <w:t>/album/{id}</w:t>
@@ -2069,7 +1907,6 @@
             <w:r>
               <w:rPr>
                 <w:b w:val="0"/>
-                <w:rFonts w:ascii="Consolas" w:hAnsi="Consolas"/>
                 <w:sz w:val="18"/>
               </w:rPr>
               <w:t>/artist/{id}</w:t>
@@ -2164,7 +2001,6 @@
             <w:r>
               <w:rPr>
                 <w:b w:val="0"/>
-                <w:rFonts w:ascii="Consolas" w:hAnsi="Consolas"/>
                 <w:sz w:val="18"/>
               </w:rPr>
               <w:t>dados/brutos/AAAA-MM-DD/</w:t>
@@ -2179,7 +2015,6 @@
             <w:r>
               <w:rPr>
                 <w:b w:val="0"/>
-                <w:rFonts w:ascii="Consolas" w:hAnsi="Consolas"/>
                 <w:sz w:val="18"/>
               </w:rPr>
               <w:t>infos.json</w:t>
@@ -2194,7 +2029,6 @@
             <w:r>
               <w:rPr>
                 <w:b w:val="0"/>
-                <w:rFonts w:ascii="Consolas" w:hAnsi="Consolas"/>
                 <w:sz w:val="18"/>
               </w:rPr>
               <w:t>generos.json</w:t>
@@ -2209,7 +2043,6 @@
             <w:r>
               <w:rPr>
                 <w:b w:val="0"/>
-                <w:rFonts w:ascii="Consolas" w:hAnsi="Consolas"/>
                 <w:sz w:val="18"/>
               </w:rPr>
               <w:t>charts.json</w:t>
@@ -2224,7 +2057,6 @@
             <w:r>
               <w:rPr>
                 <w:b w:val="0"/>
-                <w:rFonts w:ascii="Consolas" w:hAnsi="Consolas"/>
                 <w:sz w:val="18"/>
               </w:rPr>
               <w:t>faixas.json</w:t>
@@ -2239,7 +2071,6 @@
             <w:r>
               <w:rPr>
                 <w:b w:val="0"/>
-                <w:rFonts w:ascii="Consolas" w:hAnsi="Consolas"/>
                 <w:sz w:val="18"/>
               </w:rPr>
               <w:t>albuns.json</w:t>
@@ -2254,7 +2085,6 @@
             <w:r>
               <w:rPr>
                 <w:b w:val="0"/>
-                <w:rFonts w:ascii="Consolas" w:hAnsi="Consolas"/>
                 <w:sz w:val="18"/>
               </w:rPr>
               <w:t>artistas.json</w:t>
@@ -2269,7 +2099,6 @@
             <w:r>
               <w:rPr>
                 <w:b w:val="0"/>
-                <w:rFonts w:ascii="Consolas" w:hAnsi="Consolas"/>
                 <w:sz w:val="18"/>
               </w:rPr>
               <w:t>metadados.json</w:t>
@@ -2284,7 +2113,6 @@
             <w:r>
               <w:rPr>
                 <w:b w:val="0"/>
-                <w:rFonts w:ascii="Consolas" w:hAnsi="Consolas"/>
                 <w:sz w:val="18"/>
               </w:rPr>
               <w:t>BAIXAR_DA_API = True</w:t>
@@ -2317,7 +2145,6 @@
             <w:r>
               <w:rPr>
                 <w:b w:val="0"/>
-                <w:rFonts w:ascii="Consolas" w:hAnsi="Consolas"/>
                 <w:sz w:val="18"/>
               </w:rPr>
               <w:t>dados/brutos/2026-10-16/</w:t>
@@ -2380,7 +2207,6 @@
             <w:r>
               <w:rPr>
                 <w:b w:val="0"/>
-                <w:rFonts w:ascii="Consolas" w:hAnsi="Consolas"/>
                 <w:sz w:val="18"/>
               </w:rPr>
               <w:t>BAIXAR_DA_API = False</w:t>
@@ -2395,7 +2221,6 @@
             <w:r>
               <w:rPr>
                 <w:b w:val="0"/>
-                <w:rFonts w:ascii="Consolas" w:hAnsi="Consolas"/>
                 <w:sz w:val="18"/>
               </w:rPr>
               <w:t>dados/brutos/</w:t>
@@ -2410,7 +2235,6 @@
             <w:r>
               <w:rPr>
                 <w:b w:val="0"/>
-                <w:rFonts w:ascii="Consolas" w:hAnsi="Consolas"/>
                 <w:sz w:val="18"/>
               </w:rPr>
               <w:t>metadados.json</w:t>
@@ -2491,7 +2315,6 @@
             <w:r>
               <w:rPr>
                 <w:b w:val="0"/>
-                <w:rFonts w:ascii="Consolas" w:hAnsi="Consolas"/>
                 <w:sz w:val="18"/>
               </w:rPr>
               <w:t>df_bruto</w:t>
@@ -2506,7 +2329,6 @@
             <w:r>
               <w:rPr>
                 <w:b w:val="0"/>
-                <w:rFonts w:ascii="Consolas" w:hAnsi="Consolas"/>
                 <w:sz w:val="18"/>
               </w:rPr>
               <w:t>chart_id_genero</w:t>
@@ -2521,7 +2343,6 @@
             <w:r>
               <w:rPr>
                 <w:b w:val="0"/>
-                <w:rFonts w:ascii="Consolas" w:hAnsi="Consolas"/>
                 <w:sz w:val="18"/>
               </w:rPr>
               <w:t>chart_nome_genero</w:t>
@@ -2536,7 +2357,6 @@
             <w:r>
               <w:rPr>
                 <w:b w:val="0"/>
-                <w:rFonts w:ascii="Consolas" w:hAnsi="Consolas"/>
                 <w:sz w:val="18"/>
               </w:rPr>
               <w:t>chart_ordem</w:t>
@@ -2551,7 +2371,6 @@
             <w:r>
               <w:rPr>
                 <w:b w:val="0"/>
-                <w:rFonts w:ascii="Consolas" w:hAnsi="Consolas"/>
                 <w:sz w:val="18"/>
               </w:rPr>
               <w:t>detalhe_faixa_</w:t>
@@ -2566,7 +2385,6 @@
             <w:r>
               <w:rPr>
                 <w:b w:val="0"/>
-                <w:rFonts w:ascii="Consolas" w:hAnsi="Consolas"/>
                 <w:sz w:val="18"/>
               </w:rPr>
               <w:t>detalhe_album_</w:t>
@@ -2581,7 +2399,6 @@
             <w:r>
               <w:rPr>
                 <w:b w:val="0"/>
-                <w:rFonts w:ascii="Consolas" w:hAnsi="Consolas"/>
                 <w:sz w:val="18"/>
               </w:rPr>
               <w:t>detalhe_artista_</w:t>
@@ -2721,44 +2538,39 @@
         <w:t>A coleta de 16/10/2026 (21h03 a 21h41 UTC) fez 6.591 chamadas, sem novas tentativas nem erros (</w:t>
       </w:r>
       <w:r>
-        <w:rPr>
-          <w:rFonts w:ascii="Consolas" w:hAnsi="Consolas"/>
-          <w:sz w:val="18"/>
-        </w:rPr>
         <w:t>dados/brutos/2026-10-16/metadados.json</w:t>
       </w:r>
       <w:r>
         <w:t>). Os 28 charts (o geral e 27 gêneros) vieram com 100 itens cada, numa página: é o que a API oferece (</w:t>
       </w:r>
       <w:r>
-        <w:rPr>
-          <w:rFonts w:ascii="Consolas" w:hAnsi="Consolas"/>
-          <w:sz w:val="18"/>
-        </w:rPr>
         <w:t>total</w:t>
       </w:r>
       <w:r>
         <w:t xml:space="preserve"> = 100), abaixo do teto de 300. O </w:t>
       </w:r>
       <w:r>
-        <w:rPr>
-          <w:rFonts w:ascii="Consolas" w:hAnsi="Consolas"/>
-          <w:sz w:val="18"/>
-        </w:rPr>
         <w:t>df_bruto</w:t>
       </w:r>
       <w:r>
         <w:t xml:space="preserve"> tem 2.800 linhas e 102 colunas, com 2.581 faixas, 2.292 álbuns e 1.688 artistas únicos, e nenhum item sem detalhe (notebook §2, célula "Verificação do carregamento"). O retrato fica versionado em </w:t>
       </w:r>
       <w:r>
-        <w:rPr>
-          <w:rFonts w:ascii="Consolas" w:hAnsi="Consolas"/>
-          <w:sz w:val="18"/>
-        </w:rPr>
         <w:t>dados/brutos/AAAA-MM-DD/</w:t>
       </w:r>
       <w:r>
         <w:t xml:space="preserve"> e toda execução lê o mesmo. A única etapa manual é a coleta, feita uma vez no Google Colab ou na máquina de um integrante (a API exige acesso direto à internet), com o retrato enviado ao repositório.</w:t>
+      </w:r>
+    </w:p>
+    <w:p>
+      <w:pPr>
+        <w:spacing w:after="80"/>
+        <w:pBdr>
+          <w:bottom w:val="single" w:sz="3" w:color="E2E2E2"/>
+        </w:pBdr>
+      </w:pPr>
+      <w:r>
+        <w:t xml:space="preserve"> </w:t>
       </w:r>
     </w:p>
     <w:p>
@@ -2802,10 +2614,7 @@
         <w:t xml:space="preserve">ocorrência de faixa num chart de origem, no retrato de 16/10/2026: 2.800 ocorrências, 102 atributos, 2.581 faixas, 28 charts (geral e 27 gêneros). Evidência: notebook §3, célula “Visão geral e tipos observados”, sobre </w:t>
       </w:r>
       <w:r>
-        <w:rPr>
-          <w:rFonts w:ascii="Consolas" w:hAnsi="Consolas"/>
-          <w:sz w:val="18"/>
-        </w:rPr>
+        <w:rPr/>
         <w:t>dados/brutos/2026-10-16/</w:t>
       </w:r>
       <w:r>
@@ -2824,10 +2633,7 @@
         <w:t xml:space="preserve">Identificação dos registros  </w:t>
       </w:r>
       <w:r>
-        <w:rPr>
-          <w:rFonts w:ascii="Consolas" w:hAnsi="Consolas"/>
-          <w:sz w:val="18"/>
-        </w:rPr>
+        <w:rPr/>
         <w:t>id</w:t>
       </w:r>
       <w:r>
@@ -2835,10 +2641,7 @@
         <w:t xml:space="preserve"> identifica a faixa e se repete entre charts; a chave é o par </w:t>
       </w:r>
       <w:r>
-        <w:rPr>
-          <w:rFonts w:ascii="Consolas" w:hAnsi="Consolas"/>
-          <w:sz w:val="18"/>
-        </w:rPr>
+        <w:rPr/>
         <w:t>chart_id_genero</w:t>
       </w:r>
       <w:r>
@@ -2846,10 +2649,7 @@
         <w:t xml:space="preserve"> e </w:t>
       </w:r>
       <w:r>
-        <w:rPr>
-          <w:rFonts w:ascii="Consolas" w:hAnsi="Consolas"/>
-          <w:sz w:val="18"/>
-        </w:rPr>
+        <w:rPr/>
         <w:t>id</w:t>
       </w:r>
       <w:r>
@@ -2871,10 +2671,6 @@
         <w:t xml:space="preserve">Atributos usados pelas P1–P4, pelo RA2 e por este diagnóstico; os demais (URLs, capas, países, colaboradores) ficam no bruto. Os 102 atributos e suas ausências estão nas células “Visão geral e tipos observados” e “Ausências nulas e textos vazios”. Tipos do pandas 2.3.3; textos são </w:t>
       </w:r>
       <w:r>
-        <w:rPr>
-          <w:rFonts w:ascii="Consolas" w:hAnsi="Consolas"/>
-          <w:sz w:val="18"/>
-        </w:rPr>
         <w:t>object</w:t>
       </w:r>
       <w:r>
@@ -3035,7 +2831,6 @@
             <w:r>
               <w:rPr>
                 <w:b w:val="0"/>
-                <w:rFonts w:ascii="Consolas" w:hAnsi="Consolas"/>
                 <w:sz w:val="18"/>
               </w:rPr>
               <w:t>chart_id_genero</w:t>
@@ -3141,7 +2936,6 @@
             <w:r>
               <w:rPr>
                 <w:b w:val="0"/>
-                <w:rFonts w:ascii="Consolas" w:hAnsi="Consolas"/>
                 <w:sz w:val="18"/>
               </w:rPr>
               <w:t>chart_nome_genero</w:t>
@@ -3247,7 +3041,6 @@
             <w:r>
               <w:rPr>
                 <w:b w:val="0"/>
-                <w:rFonts w:ascii="Consolas" w:hAnsi="Consolas"/>
                 <w:sz w:val="18"/>
               </w:rPr>
               <w:t>chart_ordem</w:t>
@@ -3353,7 +3146,6 @@
             <w:r>
               <w:rPr>
                 <w:b w:val="0"/>
-                <w:rFonts w:ascii="Consolas" w:hAnsi="Consolas"/>
                 <w:sz w:val="18"/>
               </w:rPr>
               <w:t>id</w:t>
@@ -3459,7 +3251,6 @@
             <w:r>
               <w:rPr>
                 <w:b w:val="0"/>
-                <w:rFonts w:ascii="Consolas" w:hAnsi="Consolas"/>
                 <w:sz w:val="18"/>
               </w:rPr>
               <w:t>title</w:t>
@@ -3565,7 +3356,6 @@
             <w:r>
               <w:rPr>
                 <w:b w:val="0"/>
-                <w:rFonts w:ascii="Consolas" w:hAnsi="Consolas"/>
                 <w:sz w:val="18"/>
               </w:rPr>
               <w:t>title_version</w:t>
@@ -3671,7 +3461,6 @@
             <w:r>
               <w:rPr>
                 <w:b w:val="0"/>
-                <w:rFonts w:ascii="Consolas" w:hAnsi="Consolas"/>
                 <w:sz w:val="18"/>
               </w:rPr>
               <w:t>duration</w:t>
@@ -3777,7 +3566,6 @@
             <w:r>
               <w:rPr>
                 <w:b w:val="0"/>
-                <w:rFonts w:ascii="Consolas" w:hAnsi="Consolas"/>
                 <w:sz w:val="18"/>
               </w:rPr>
               <w:t>rank</w:t>
@@ -3883,7 +3671,6 @@
             <w:r>
               <w:rPr>
                 <w:b w:val="0"/>
-                <w:rFonts w:ascii="Consolas" w:hAnsi="Consolas"/>
                 <w:sz w:val="18"/>
               </w:rPr>
               <w:t>position</w:t>
@@ -3989,7 +3776,6 @@
             <w:r>
               <w:rPr>
                 <w:b w:val="0"/>
-                <w:rFonts w:ascii="Consolas" w:hAnsi="Consolas"/>
                 <w:sz w:val="18"/>
               </w:rPr>
               <w:t>explicit_lyrics</w:t>
@@ -4095,7 +3881,6 @@
             <w:r>
               <w:rPr>
                 <w:b w:val="0"/>
-                <w:rFonts w:ascii="Consolas" w:hAnsi="Consolas"/>
                 <w:sz w:val="18"/>
               </w:rPr>
               <w:t>preview</w:t>
@@ -4201,7 +3986,6 @@
             <w:r>
               <w:rPr>
                 <w:b w:val="0"/>
-                <w:rFonts w:ascii="Consolas" w:hAnsi="Consolas"/>
                 <w:sz w:val="18"/>
               </w:rPr>
               <w:t>artist_id</w:t>
@@ -4307,7 +4091,6 @@
             <w:r>
               <w:rPr>
                 <w:b w:val="0"/>
-                <w:rFonts w:ascii="Consolas" w:hAnsi="Consolas"/>
                 <w:sz w:val="18"/>
               </w:rPr>
               <w:t>artist_name</w:t>
@@ -4413,7 +4196,6 @@
             <w:r>
               <w:rPr>
                 <w:b w:val="0"/>
-                <w:rFonts w:ascii="Consolas" w:hAnsi="Consolas"/>
                 <w:sz w:val="18"/>
               </w:rPr>
               <w:t>album_id</w:t>
@@ -4519,7 +4301,6 @@
             <w:r>
               <w:rPr>
                 <w:b w:val="0"/>
-                <w:rFonts w:ascii="Consolas" w:hAnsi="Consolas"/>
                 <w:sz w:val="18"/>
               </w:rPr>
               <w:t>detalhe_faixa_id</w:t>
@@ -4625,7 +4406,6 @@
             <w:r>
               <w:rPr>
                 <w:b w:val="0"/>
-                <w:rFonts w:ascii="Consolas" w:hAnsi="Consolas"/>
                 <w:sz w:val="18"/>
               </w:rPr>
               <w:t>detalhe_faixa_duration</w:t>
@@ -4731,7 +4511,6 @@
             <w:r>
               <w:rPr>
                 <w:b w:val="0"/>
-                <w:rFonts w:ascii="Consolas" w:hAnsi="Consolas"/>
                 <w:sz w:val="18"/>
               </w:rPr>
               <w:t>detalhe_faixa_rank</w:t>
@@ -4837,7 +4616,6 @@
             <w:r>
               <w:rPr>
                 <w:b w:val="0"/>
-                <w:rFonts w:ascii="Consolas" w:hAnsi="Consolas"/>
                 <w:sz w:val="18"/>
               </w:rPr>
               <w:t>detalhe_faixa_release_date</w:t>
@@ -4943,7 +4721,6 @@
             <w:r>
               <w:rPr>
                 <w:b w:val="0"/>
-                <w:rFonts w:ascii="Consolas" w:hAnsi="Consolas"/>
                 <w:sz w:val="18"/>
               </w:rPr>
               <w:t>detalhe_faixa_bpm</w:t>
@@ -5049,7 +4826,6 @@
             <w:r>
               <w:rPr>
                 <w:b w:val="0"/>
-                <w:rFonts w:ascii="Consolas" w:hAnsi="Consolas"/>
                 <w:sz w:val="18"/>
               </w:rPr>
               <w:t>detalhe_faixa_gain</w:t>
@@ -5155,7 +4931,6 @@
             <w:r>
               <w:rPr>
                 <w:b w:val="0"/>
-                <w:rFonts w:ascii="Consolas" w:hAnsi="Consolas"/>
                 <w:sz w:val="18"/>
               </w:rPr>
               <w:t>detalhe_album_id</w:t>
@@ -5261,7 +5036,6 @@
             <w:r>
               <w:rPr>
                 <w:b w:val="0"/>
-                <w:rFonts w:ascii="Consolas" w:hAnsi="Consolas"/>
                 <w:sz w:val="18"/>
               </w:rPr>
               <w:t>detalhe_album_genre_id</w:t>
@@ -5367,7 +5141,6 @@
             <w:r>
               <w:rPr>
                 <w:b w:val="0"/>
-                <w:rFonts w:ascii="Consolas" w:hAnsi="Consolas"/>
                 <w:sz w:val="18"/>
               </w:rPr>
               <w:t>detalhe_album_release_date</w:t>
@@ -5473,7 +5246,6 @@
             <w:r>
               <w:rPr>
                 <w:b w:val="0"/>
-                <w:rFonts w:ascii="Consolas" w:hAnsi="Consolas"/>
                 <w:sz w:val="18"/>
               </w:rPr>
               <w:t>detalhe_artista_id</w:t>
@@ -5579,7 +5351,6 @@
             <w:r>
               <w:rPr>
                 <w:b w:val="0"/>
-                <w:rFonts w:ascii="Consolas" w:hAnsi="Consolas"/>
                 <w:sz w:val="18"/>
               </w:rPr>
               <w:t>detalhe_artista_nb_fan</w:t>
@@ -5692,130 +5463,78 @@
         <w:t xml:space="preserve">Q1 cobre </w:t>
       </w:r>
       <w:r>
-        <w:rPr>
-          <w:rFonts w:ascii="Consolas" w:hAnsi="Consolas"/>
-          <w:sz w:val="18"/>
-        </w:rPr>
         <w:t>id</w:t>
       </w:r>
       <w:r>
         <w:t xml:space="preserve">, </w:t>
       </w:r>
       <w:r>
-        <w:rPr>
-          <w:rFonts w:ascii="Consolas" w:hAnsi="Consolas"/>
-          <w:sz w:val="18"/>
-        </w:rPr>
         <w:t>chart_id_genero</w:t>
       </w:r>
       <w:r>
         <w:t xml:space="preserve">, </w:t>
       </w:r>
       <w:r>
-        <w:rPr>
-          <w:rFonts w:ascii="Consolas" w:hAnsi="Consolas"/>
-          <w:sz w:val="18"/>
-        </w:rPr>
         <w:t>chart_nome_genero</w:t>
       </w:r>
       <w:r>
         <w:t xml:space="preserve">, </w:t>
       </w:r>
       <w:r>
-        <w:rPr>
-          <w:rFonts w:ascii="Consolas" w:hAnsi="Consolas"/>
-          <w:sz w:val="18"/>
-        </w:rPr>
         <w:t>title</w:t>
       </w:r>
       <w:r>
         <w:t xml:space="preserve">, </w:t>
       </w:r>
       <w:r>
-        <w:rPr>
-          <w:rFonts w:ascii="Consolas" w:hAnsi="Consolas"/>
-          <w:sz w:val="18"/>
-        </w:rPr>
         <w:t>duration</w:t>
       </w:r>
       <w:r>
         <w:t xml:space="preserve">, </w:t>
       </w:r>
       <w:r>
-        <w:rPr>
-          <w:rFonts w:ascii="Consolas" w:hAnsi="Consolas"/>
-          <w:sz w:val="18"/>
-        </w:rPr>
         <w:t>rank</w:t>
       </w:r>
       <w:r>
         <w:t xml:space="preserve">, </w:t>
       </w:r>
       <w:r>
-        <w:rPr>
-          <w:rFonts w:ascii="Consolas" w:hAnsi="Consolas"/>
-          <w:sz w:val="18"/>
-        </w:rPr>
         <w:t>position</w:t>
       </w:r>
       <w:r>
         <w:t xml:space="preserve">, </w:t>
       </w:r>
       <w:r>
-        <w:rPr>
-          <w:rFonts w:ascii="Consolas" w:hAnsi="Consolas"/>
-          <w:sz w:val="18"/>
-        </w:rPr>
         <w:t>artist_id</w:t>
       </w:r>
       <w:r>
         <w:t xml:space="preserve">, </w:t>
       </w:r>
       <w:r>
-        <w:rPr>
-          <w:rFonts w:ascii="Consolas" w:hAnsi="Consolas"/>
-          <w:sz w:val="18"/>
-        </w:rPr>
         <w:t>artist_name</w:t>
       </w:r>
       <w:r>
         <w:t xml:space="preserve">, </w:t>
       </w:r>
       <w:r>
-        <w:rPr>
-          <w:rFonts w:ascii="Consolas" w:hAnsi="Consolas"/>
-          <w:sz w:val="18"/>
-        </w:rPr>
         <w:t>album_id</w:t>
       </w:r>
       <w:r>
         <w:t xml:space="preserve">, </w:t>
       </w:r>
       <w:r>
-        <w:rPr>
-          <w:rFonts w:ascii="Consolas" w:hAnsi="Consolas"/>
-          <w:sz w:val="18"/>
-        </w:rPr>
         <w:t>detalhe_faixa_release_date</w:t>
       </w:r>
       <w:r>
         <w:t xml:space="preserve"> e </w:t>
       </w:r>
       <w:r>
-        <w:rPr>
-          <w:rFonts w:ascii="Consolas" w:hAnsi="Consolas"/>
-          <w:sz w:val="18"/>
-        </w:rPr>
         <w:t>detalhe_artista_nb_fan</w:t>
       </w:r>
       <w:r>
         <w:t xml:space="preserve">. Q7 espera inteiros nas chaves e contagens, reais em BPM e gain e booleano em </w:t>
       </w:r>
       <w:r>
-        <w:rPr>
-          <w:rFonts w:ascii="Consolas" w:hAnsi="Consolas"/>
-          <w:sz w:val="18"/>
-        </w:rPr>
         <w:t>explicit_lyrics</w:t>
       </w:r>
       <w:r>
@@ -5828,10 +5547,6 @@
         <w:t xml:space="preserve">Em Q11, a faixa 4346251442, “Dirty Bird”, tem data </w:t>
       </w:r>
       <w:r>
-        <w:rPr>
-          <w:rFonts w:ascii="Consolas" w:hAnsi="Consolas"/>
-          <w:sz w:val="18"/>
-        </w:rPr>
         <w:t>2026-10-28</w:t>
       </w:r>
       <w:r>
@@ -5844,10 +5559,6 @@
         <w:t xml:space="preserve">Uma ocorrência não tem capa nem lista de faixas do álbum (1/2.800; 0,04%), metadados fora das P1–P4 e do RA2. Em </w:t>
       </w:r>
       <w:r>
-        <w:rPr>
-          <w:rFonts w:ascii="Consolas" w:hAnsi="Consolas"/>
-          <w:sz w:val="18"/>
-        </w:rPr>
         <w:t>title_version</w:t>
       </w:r>
       <w:r>
@@ -8217,14 +7928,21 @@
         <w:t xml:space="preserve">Q1, Q5–Q8, Q13–Q14 e Q18–Q21 não acharam ocorrências nos testes executados. As decisões estão na seção 04; esta seção não altera </w:t>
       </w:r>
       <w:r>
-        <w:rPr>
-          <w:rFonts w:ascii="Consolas" w:hAnsi="Consolas"/>
-          <w:sz w:val="18"/>
-        </w:rPr>
         <w:t>df_bruto</w:t>
       </w:r>
       <w:r>
         <w:t>.</w:t>
+      </w:r>
+    </w:p>
+    <w:p>
+      <w:pPr>
+        <w:spacing w:after="80"/>
+        <w:pBdr>
+          <w:bottom w:val="single" w:sz="3" w:color="E2E2E2"/>
+        </w:pBdr>
+      </w:pPr>
+      <w:r>
+        <w:t xml:space="preserve"> </w:t>
       </w:r>
     </w:p>
     <w:p>
@@ -8292,6 +8010,17 @@
     </w:p>
     <w:p>
       <w:pPr>
+        <w:spacing w:after="80"/>
+        <w:pBdr>
+          <w:bottom w:val="single" w:sz="3" w:color="E2E2E2"/>
+        </w:pBdr>
+      </w:pPr>
+      <w:r>
+        <w:t xml:space="preserve"> </w:t>
+      </w:r>
+    </w:p>
+    <w:p>
+      <w:pPr>
         <w:pStyle w:val="Heading2"/>
       </w:pPr>
       <w:r>
@@ -8302,6 +8031,17 @@
       <w:pPr/>
       <w:r>
         <w:t>Uma linha por par chart-faixa: excluir pelo id apagaria participações das P1–P4. Nenhum dos 2.800 registros saiu; a chave final inclui a data da coleta.</w:t>
+      </w:r>
+    </w:p>
+    <w:p>
+      <w:pPr>
+        <w:spacing w:after="80"/>
+        <w:pBdr>
+          <w:bottom w:val="single" w:sz="3" w:color="E2E2E2"/>
+        </w:pBdr>
+      </w:pPr>
+      <w:r>
+        <w:t xml:space="preserve"> </w:t>
       </w:r>
     </w:p>
     <w:p>
@@ -8335,6 +8075,17 @@
     </w:p>
     <w:p>
       <w:pPr>
+        <w:spacing w:after="80"/>
+        <w:pBdr>
+          <w:bottom w:val="single" w:sz="3" w:color="E2E2E2"/>
+        </w:pBdr>
+      </w:pPr>
+      <w:r>
+        <w:t xml:space="preserve"> </w:t>
+      </w:r>
+    </w:p>
+    <w:p>
+      <w:pPr>
         <w:spacing w:after="200"/>
       </w:pPr>
       <w:r>
@@ -8364,6 +8115,17 @@
     </w:p>
     <w:p>
       <w:pPr>
+        <w:spacing w:after="80"/>
+        <w:pBdr>
+          <w:bottom w:val="single" w:sz="3" w:color="E2E2E2"/>
+        </w:pBdr>
+      </w:pPr>
+      <w:r>
+        <w:t xml:space="preserve"> </w:t>
+      </w:r>
+    </w:p>
+    <w:p>
+      <w:pPr>
         <w:pStyle w:val="Heading2"/>
       </w:pPr>
       <w:r>
@@ -8374,6 +8136,17 @@
       <w:pPr/>
       <w:r>
         <w:t>Espaços nas pontas removidos de título, artista e chart, preservando acentos e maiúsculas; um campo mudou, nenhum registro saiu.</w:t>
+      </w:r>
+    </w:p>
+    <w:p>
+      <w:pPr>
+        <w:spacing w:after="80"/>
+        <w:pBdr>
+          <w:bottom w:val="single" w:sz="3" w:color="E2E2E2"/>
+        </w:pBdr>
+      </w:pPr>
+      <w:r>
+        <w:t xml:space="preserve"> </w:t>
       </w:r>
     </w:p>
     <w:p>
@@ -8407,6 +8180,17 @@
     </w:p>
     <w:p>
       <w:pPr>
+        <w:spacing w:after="80"/>
+        <w:pBdr>
+          <w:bottom w:val="single" w:sz="3" w:color="E2E2E2"/>
+        </w:pBdr>
+      </w:pPr>
+      <w:r>
+        <w:t xml:space="preserve"> </w:t>
+      </w:r>
+    </w:p>
+    <w:p>
+      <w:pPr>
         <w:spacing w:after="200"/>
       </w:pPr>
       <w:r>
@@ -8436,6 +8220,17 @@
     </w:p>
     <w:p>
       <w:pPr>
+        <w:spacing w:after="80"/>
+        <w:pBdr>
+          <w:bottom w:val="single" w:sz="3" w:color="E2E2E2"/>
+        </w:pBdr>
+      </w:pPr>
+      <w:r>
+        <w:t xml:space="preserve"> </w:t>
+      </w:r>
+    </w:p>
+    <w:p>
+      <w:pPr>
         <w:pStyle w:val="Heading2"/>
       </w:pPr>
       <w:r>
@@ -8446,6 +8241,17 @@
       <w:pPr/>
       <w:r>
         <w:t>Lançamento convertido para data sem mudar o valor; criados data_coleta (metadados, UTC) e lancamento_posterior_coleta, que separa o futuro dos já ocorridos na P2. Sem exclusão nem estimativa.</w:t>
+      </w:r>
+    </w:p>
+    <w:p>
+      <w:pPr>
+        <w:spacing w:after="80"/>
+        <w:pBdr>
+          <w:bottom w:val="single" w:sz="3" w:color="E2E2E2"/>
+        </w:pBdr>
+      </w:pPr>
+      <w:r>
+        <w:t xml:space="preserve"> </w:t>
       </w:r>
     </w:p>
     <w:p>
@@ -8479,6 +8285,17 @@
     </w:p>
     <w:p>
       <w:pPr>
+        <w:spacing w:after="80"/>
+        <w:pBdr>
+          <w:bottom w:val="single" w:sz="3" w:color="E2E2E2"/>
+        </w:pBdr>
+      </w:pPr>
+      <w:r>
+        <w:t xml:space="preserve"> </w:t>
+      </w:r>
+    </w:p>
+    <w:p>
+      <w:pPr>
         <w:spacing w:after="200"/>
       </w:pPr>
       <w:r>
@@ -8508,6 +8325,17 @@
     </w:p>
     <w:p>
       <w:pPr>
+        <w:spacing w:after="80"/>
+        <w:pBdr>
+          <w:bottom w:val="single" w:sz="3" w:color="E2E2E2"/>
+        </w:pBdr>
+      </w:pPr>
+      <w:r>
+        <w:t xml:space="preserve"> </w:t>
+      </w:r>
+    </w:p>
+    <w:p>
+      <w:pPr>
         <w:pStyle w:val="Heading2"/>
       </w:pPr>
       <w:r>
@@ -8518,6 +8346,17 @@
       <w:pPr/>
       <w:r>
         <w:t>Id e nome do chart mantidos e tipo_chart (geral ou genero) criado; o geral serve à P3 e o gênero do álbum não substitui a origem das P1–P4. Sem exclusão nem gênero estimado.</w:t>
+      </w:r>
+    </w:p>
+    <w:p>
+      <w:pPr>
+        <w:spacing w:after="80"/>
+        <w:pBdr>
+          <w:bottom w:val="single" w:sz="3" w:color="E2E2E2"/>
+        </w:pBdr>
+      </w:pPr>
+      <w:r>
+        <w:t xml:space="preserve"> </w:t>
       </w:r>
     </w:p>
     <w:p>
@@ -8551,6 +8390,17 @@
     </w:p>
     <w:p>
       <w:pPr>
+        <w:spacing w:after="80"/>
+        <w:pBdr>
+          <w:bottom w:val="single" w:sz="3" w:color="E2E2E2"/>
+        </w:pBdr>
+      </w:pPr>
+      <w:r>
+        <w:t xml:space="preserve"> </w:t>
+      </w:r>
+    </w:p>
+    <w:p>
+      <w:pPr>
         <w:spacing w:after="200"/>
       </w:pPr>
       <w:r>
@@ -8580,6 +8430,17 @@
     </w:p>
     <w:p>
       <w:pPr>
+        <w:spacing w:after="80"/>
+        <w:pBdr>
+          <w:bottom w:val="single" w:sz="3" w:color="E2E2E2"/>
+        </w:pBdr>
+      </w:pPr>
+      <w:r>
+        <w:t xml:space="preserve"> </w:t>
+      </w:r>
+    </w:p>
+    <w:p>
+      <w:pPr>
         <w:pStyle w:val="Heading2"/>
       </w:pPr>
       <w:r>
@@ -8590,6 +8451,17 @@
       <w:pPr/>
       <w:r>
         <w:t>12 dos 102 atributos mais quatro de contexto ou qualidade: 16 colunas. Os 90 restantes (prévia, versão, BPM, ganho, álbum) ficam no bruto, sem imputação nem exclusão.</w:t>
+      </w:r>
+    </w:p>
+    <w:p>
+      <w:pPr>
+        <w:spacing w:after="80"/>
+        <w:pBdr>
+          <w:bottom w:val="single" w:sz="3" w:color="E2E2E2"/>
+        </w:pBdr>
+      </w:pPr>
+      <w:r>
+        <w:t xml:space="preserve"> </w:t>
       </w:r>
     </w:p>
     <w:p>
@@ -8623,6 +8495,17 @@
     </w:p>
     <w:p>
       <w:pPr>
+        <w:spacing w:after="80"/>
+        <w:pBdr>
+          <w:bottom w:val="single" w:sz="3" w:color="E2E2E2"/>
+        </w:pBdr>
+      </w:pPr>
+      <w:r>
+        <w:t xml:space="preserve"> </w:t>
+      </w:r>
+    </w:p>
+    <w:p>
+      <w:pPr>
         <w:spacing w:after="200"/>
       </w:pPr>
       <w:r>
@@ -8652,6 +8535,17 @@
     </w:p>
     <w:p>
       <w:pPr>
+        <w:spacing w:after="80"/>
+        <w:pBdr>
+          <w:bottom w:val="single" w:sz="3" w:color="E2E2E2"/>
+        </w:pBdr>
+      </w:pPr>
+      <w:r>
+        <w:t xml:space="preserve"> </w:t>
+      </w:r>
+    </w:p>
+    <w:p>
+      <w:pPr>
         <w:pStyle w:val="Heading2"/>
       </w:pPr>
       <w:r>
@@ -8662,6 +8556,17 @@
       <w:pPr/>
       <w:r>
         <w:t>Nomes em português (rank mantido pelo gerador): oito inteiros, quatro textos, duas datas e dois booleanos. Valores válidos intactos; falha de conversão não vira zero.</w:t>
+      </w:r>
+    </w:p>
+    <w:p>
+      <w:pPr>
+        <w:spacing w:after="80"/>
+        <w:pBdr>
+          <w:bottom w:val="single" w:sz="3" w:color="E2E2E2"/>
+        </w:pBdr>
+      </w:pPr>
+      <w:r>
+        <w:t xml:space="preserve"> </w:t>
       </w:r>
     </w:p>
     <w:p>
@@ -8695,6 +8600,17 @@
     </w:p>
     <w:p>
       <w:pPr>
+        <w:spacing w:after="80"/>
+        <w:pBdr>
+          <w:bottom w:val="single" w:sz="3" w:color="E2E2E2"/>
+        </w:pBdr>
+      </w:pPr>
+      <w:r>
+        <w:t xml:space="preserve"> </w:t>
+      </w:r>
+    </w:p>
+    <w:p>
+      <w:pPr>
         <w:spacing w:after="200"/>
       </w:pPr>
       <w:r>
@@ -8724,6 +8640,17 @@
     </w:p>
     <w:p>
       <w:pPr>
+        <w:spacing w:after="80"/>
+        <w:pBdr>
+          <w:bottom w:val="single" w:sz="3" w:color="E2E2E2"/>
+        </w:pBdr>
+      </w:pPr>
+      <w:r>
+        <w:t xml:space="preserve"> </w:t>
+      </w:r>
+    </w:p>
+    <w:p>
+      <w:pPr>
         <w:pStyle w:val="Heading2"/>
       </w:pPr>
       <w:r>
@@ -8734,6 +8661,17 @@
       <w:pPr/>
       <w:r>
         <w:t>Valores mantidos e duracao_fora_limites_iqr criado: extremo não comprova erro, e cortá-lo alteraria a distribuição da P1.</w:t>
+      </w:r>
+    </w:p>
+    <w:p>
+      <w:pPr>
+        <w:spacing w:after="80"/>
+        <w:pBdr>
+          <w:bottom w:val="single" w:sz="3" w:color="E2E2E2"/>
+        </w:pBdr>
+      </w:pPr>
+      <w:r>
+        <w:t xml:space="preserve"> </w:t>
       </w:r>
     </w:p>
     <w:p>
@@ -8767,6 +8705,17 @@
     </w:p>
     <w:p>
       <w:pPr>
+        <w:spacing w:after="80"/>
+        <w:pBdr>
+          <w:bottom w:val="single" w:sz="3" w:color="E2E2E2"/>
+        </w:pBdr>
+      </w:pPr>
+      <w:r>
+        <w:t xml:space="preserve"> </w:t>
+      </w:r>
+    </w:p>
+    <w:p>
+      <w:pPr>
         <w:spacing w:after="200"/>
       </w:pPr>
       <w:r>
@@ -8796,6 +8745,17 @@
     </w:p>
     <w:p>
       <w:pPr>
+        <w:spacing w:after="80"/>
+        <w:pBdr>
+          <w:bottom w:val="single" w:sz="3" w:color="E2E2E2"/>
+        </w:pBdr>
+      </w:pPr>
+      <w:r>
+        <w:t xml:space="preserve"> </w:t>
+      </w:r>
+    </w:p>
+    <w:p>
+      <w:pPr>
         <w:pStyle w:val="Heading2"/>
       </w:pPr>
       <w:r>
@@ -8806,6 +8766,17 @@
       <w:pPr/>
       <w:r>
         <w:t>Valores aprovados mantidos e testes repetidos, sem imputação; o df_bruto ficou intacto (a preparação usou uma cópia).</w:t>
+      </w:r>
+    </w:p>
+    <w:p>
+      <w:pPr>
+        <w:spacing w:after="80"/>
+        <w:pBdr>
+          <w:bottom w:val="single" w:sz="3" w:color="E2E2E2"/>
+        </w:pBdr>
+      </w:pPr>
+      <w:r>
+        <w:t xml:space="preserve"> </w:t>
       </w:r>
     </w:p>
     <w:p>
@@ -8835,6 +8806,17 @@
       <w:pPr/>
       <w:r>
         <w:t>2.800 registros aprovados em obrigatórios, chave, domínios, nomes, datas, sinalizações e integridade; valores iguais ao bruto e releitura igual à memória. Evidência: notebook §5, "Gravação e releitura do conjunto preparado".</w:t>
+      </w:r>
+    </w:p>
+    <w:p>
+      <w:pPr>
+        <w:spacing w:after="80"/>
+        <w:pBdr>
+          <w:bottom w:val="single" w:sz="3" w:color="E2E2E2"/>
+        </w:pBdr>
+      </w:pPr>
+      <w:r>
+        <w:t xml:space="preserve"> </w:t>
       </w:r>
     </w:p>
     <w:p>
@@ -9859,10 +9841,7 @@
         <w:t xml:space="preserve">Arquivo ou conjunto final  </w:t>
       </w:r>
       <w:r>
-        <w:rPr>
-          <w:rFonts w:ascii="Consolas" w:hAnsi="Consolas"/>
-          <w:sz w:val="18"/>
-        </w:rPr>
+        <w:rPr/>
         <w:t>dados/preparados/faixas_preparadas.csv</w:t>
       </w:r>
       <w:r>
@@ -9885,10 +9864,7 @@
         <w:t xml:space="preserve">uma ocorrência de faixa em um chart de origem na data da coleta, com chave </w:t>
       </w:r>
       <w:r>
-        <w:rPr>
-          <w:rFonts w:ascii="Consolas" w:hAnsi="Consolas"/>
-          <w:sz w:val="18"/>
-        </w:rPr>
+        <w:rPr/>
         <w:t>data_coleta</w:t>
       </w:r>
       <w:r>
@@ -9896,10 +9872,7 @@
         <w:t xml:space="preserve">, </w:t>
       </w:r>
       <w:r>
-        <w:rPr>
-          <w:rFonts w:ascii="Consolas" w:hAnsi="Consolas"/>
-          <w:sz w:val="18"/>
-        </w:rPr>
+        <w:rPr/>
         <w:t>id_chart</w:t>
       </w:r>
       <w:r>
@@ -9907,10 +9880,7 @@
         <w:t xml:space="preserve"> e </w:t>
       </w:r>
       <w:r>
-        <w:rPr>
-          <w:rFonts w:ascii="Consolas" w:hAnsi="Consolas"/>
-          <w:sz w:val="18"/>
-        </w:rPr>
+        <w:rPr/>
         <w:t>id_faixa</w:t>
       </w:r>
       <w:r>
@@ -9929,10 +9899,7 @@
         <w:t xml:space="preserve">Dicionário atualizado  </w:t>
       </w:r>
       <w:r>
-        <w:rPr>
-          <w:rFonts w:ascii="Consolas" w:hAnsi="Consolas"/>
-          <w:sz w:val="18"/>
-        </w:rPr>
+        <w:rPr/>
         <w:t>dados/preparados/dicionario-faixas.md</w:t>
       </w:r>
       <w:r>
@@ -9940,10 +9907,7 @@
         <w:t xml:space="preserve">, com origem, significado, tipo e domínio dos 16 atributos: oito inteiros, quatro textos, duas datas e dois booleanos. </w:t>
       </w:r>
       <w:r>
-        <w:rPr>
-          <w:rFonts w:ascii="Consolas" w:hAnsi="Consolas"/>
-          <w:sz w:val="18"/>
-        </w:rPr>
+        <w:rPr/>
         <w:t>rank</w:t>
       </w:r>
       <w:r>
@@ -11015,6 +10979,17 @@
     </w:p>
     <w:p>
       <w:pPr>
+        <w:spacing w:after="80"/>
+        <w:pBdr>
+          <w:bottom w:val="single" w:sz="3" w:color="E2E2E2"/>
+        </w:pBdr>
+      </w:pPr>
+      <w:r>
+        <w:t xml:space="preserve"> </w:t>
+      </w:r>
+    </w:p>
+    <w:p>
+      <w:pPr>
         <w:pStyle w:val="Heading2"/>
       </w:pPr>
       <w:r>
@@ -11027,10 +11002,6 @@
         <w:t xml:space="preserve">O conjunto é o retrato de 16/10/2026, com país aparente US: não é série histórica nem permite comparar países. Evidência: </w:t>
       </w:r>
       <w:r>
-        <w:rPr>
-          <w:rFonts w:ascii="Consolas" w:hAnsi="Consolas"/>
-          <w:sz w:val="18"/>
-        </w:rPr>
         <w:t>dados/brutos/2026-10-16/metadados.json</w:t>
       </w:r>
       <w:r>
@@ -11055,14 +11026,21 @@
         <w:t xml:space="preserve">As 100/2.800 ocorrências do chart geral seguem disponíveis para a P3. Os eventos por gênero do RA2 usam só </w:t>
       </w:r>
       <w:r>
-        <w:rPr>
-          <w:rFonts w:ascii="Consolas" w:hAnsi="Consolas"/>
-          <w:sz w:val="18"/>
-        </w:rPr>
         <w:t>tipo_chart == "genero"</w:t>
       </w:r>
       <w:r>
         <w:t>, 2.700/2.800 ocorrências; o filtro é aplicado na seção 9. Evidência: notebook §4, célula "Identificação do chart de origem".</w:t>
+      </w:r>
+    </w:p>
+    <w:p>
+      <w:pPr>
+        <w:spacing w:after="80"/>
+        <w:pBdr>
+          <w:bottom w:val="single" w:sz="3" w:color="E2E2E2"/>
+        </w:pBdr>
+      </w:pPr>
+      <w:r>
+        <w:t xml:space="preserve"> </w:t>
       </w:r>
     </w:p>
     <w:p>
@@ -11106,10 +11084,7 @@
         <w:t xml:space="preserve">https://github.com/Jcliz/data-analytics • tag </w:t>
       </w:r>
       <w:r>
-        <w:rPr>
-          <w:rFonts w:ascii="Consolas" w:hAnsi="Consolas"/>
-          <w:sz w:val="18"/>
-        </w:rPr>
+        <w:rPr/>
         <w:t>entrega</w:t>
       </w:r>
       <w:r>
@@ -11117,10 +11092,7 @@
         <w:t xml:space="preserve">, no commit da execução final (o PDF entregue fica em </w:t>
       </w:r>
       <w:r>
-        <w:rPr>
-          <w:rFonts w:ascii="Consolas" w:hAnsi="Consolas"/>
-          <w:sz w:val="18"/>
-        </w:rPr>
+        <w:rPr/>
         <w:t>output/entrega-ra1-ra2.pdf</w:t>
       </w:r>
       <w:r>
@@ -11143,10 +11115,7 @@
         <w:t xml:space="preserve">Google Colab (referência) ou Python 3.9 ou mais novo em máquina local • versões mínimas em </w:t>
       </w:r>
       <w:r>
-        <w:rPr>
-          <w:rFonts w:ascii="Consolas" w:hAnsi="Consolas"/>
-          <w:sz w:val="18"/>
-        </w:rPr>
+        <w:rPr/>
         <w:t>requirements.txt</w:t>
       </w:r>
       <w:r>
@@ -11287,7 +11256,6 @@
             <w:r>
               <w:rPr>
                 <w:b w:val="0"/>
-                <w:rFonts w:ascii="Consolas" w:hAnsi="Consolas"/>
                 <w:sz w:val="18"/>
               </w:rPr>
               <w:t>dados/brutos/2026-10-16/</w:t>
@@ -11302,7 +11270,6 @@
             <w:r>
               <w:rPr>
                 <w:b w:val="0"/>
-                <w:rFonts w:ascii="Consolas" w:hAnsi="Consolas"/>
                 <w:sz w:val="18"/>
               </w:rPr>
               <w:t>infos.json</w:t>
@@ -11317,7 +11284,6 @@
             <w:r>
               <w:rPr>
                 <w:b w:val="0"/>
-                <w:rFonts w:ascii="Consolas" w:hAnsi="Consolas"/>
                 <w:sz w:val="18"/>
               </w:rPr>
               <w:t>generos.json</w:t>
@@ -11332,7 +11298,6 @@
             <w:r>
               <w:rPr>
                 <w:b w:val="0"/>
-                <w:rFonts w:ascii="Consolas" w:hAnsi="Consolas"/>
                 <w:sz w:val="18"/>
               </w:rPr>
               <w:t>charts.json</w:t>
@@ -11347,7 +11312,6 @@
             <w:r>
               <w:rPr>
                 <w:b w:val="0"/>
-                <w:rFonts w:ascii="Consolas" w:hAnsi="Consolas"/>
                 <w:sz w:val="18"/>
               </w:rPr>
               <w:t>faixas.json</w:t>
@@ -11362,7 +11326,6 @@
             <w:r>
               <w:rPr>
                 <w:b w:val="0"/>
-                <w:rFonts w:ascii="Consolas" w:hAnsi="Consolas"/>
                 <w:sz w:val="18"/>
               </w:rPr>
               <w:t>albuns.json</w:t>
@@ -11377,7 +11340,6 @@
             <w:r>
               <w:rPr>
                 <w:b w:val="0"/>
-                <w:rFonts w:ascii="Consolas" w:hAnsi="Consolas"/>
                 <w:sz w:val="18"/>
               </w:rPr>
               <w:t>artistas.json</w:t>
@@ -11392,7 +11354,6 @@
             <w:r>
               <w:rPr>
                 <w:b w:val="0"/>
-                <w:rFonts w:ascii="Consolas" w:hAnsi="Consolas"/>
                 <w:sz w:val="18"/>
               </w:rPr>
               <w:t>metadados.json</w:t>
@@ -11407,7 +11368,6 @@
             <w:r>
               <w:rPr>
                 <w:b w:val="0"/>
-                <w:rFonts w:ascii="Consolas" w:hAnsi="Consolas"/>
                 <w:sz w:val="18"/>
               </w:rPr>
               <w:t>BAIXAR_DA_API = True</w:t>
@@ -11470,7 +11430,6 @@
             <w:r>
               <w:rPr>
                 <w:b w:val="0"/>
-                <w:rFonts w:ascii="Consolas" w:hAnsi="Consolas"/>
                 <w:sz w:val="18"/>
               </w:rPr>
               <w:t>notebook/projeto_data_analytics.ipynb</w:t>
@@ -11485,7 +11444,6 @@
             <w:r>
               <w:rPr>
                 <w:b w:val="0"/>
-                <w:rFonts w:ascii="Consolas" w:hAnsi="Consolas"/>
                 <w:sz w:val="18"/>
               </w:rPr>
               <w:t>python scripts/montar_notebook.py</w:t>
@@ -11500,7 +11458,6 @@
             <w:r>
               <w:rPr>
                 <w:b w:val="0"/>
-                <w:rFonts w:ascii="Consolas" w:hAnsi="Consolas"/>
                 <w:sz w:val="18"/>
               </w:rPr>
               <w:t>notebook/secoes/</w:t>
@@ -11515,7 +11472,6 @@
             <w:r>
               <w:rPr>
                 <w:b w:val="0"/>
-                <w:rFonts w:ascii="Consolas" w:hAnsi="Consolas"/>
                 <w:sz w:val="18"/>
               </w:rPr>
               <w:t>00b</w:t>
@@ -11530,7 +11486,6 @@
             <w:r>
               <w:rPr>
                 <w:b w:val="0"/>
-                <w:rFonts w:ascii="Consolas" w:hAnsi="Consolas"/>
                 <w:sz w:val="18"/>
               </w:rPr>
               <w:t>02</w:t>
@@ -11545,7 +11500,6 @@
             <w:r>
               <w:rPr>
                 <w:b w:val="0"/>
-                <w:rFonts w:ascii="Consolas" w:hAnsi="Consolas"/>
                 <w:sz w:val="18"/>
               </w:rPr>
               <w:t>03</w:t>
@@ -11560,7 +11514,6 @@
             <w:r>
               <w:rPr>
                 <w:b w:val="0"/>
-                <w:rFonts w:ascii="Consolas" w:hAnsi="Consolas"/>
                 <w:sz w:val="18"/>
               </w:rPr>
               <w:t>04</w:t>
@@ -11575,7 +11528,6 @@
             <w:r>
               <w:rPr>
                 <w:b w:val="0"/>
-                <w:rFonts w:ascii="Consolas" w:hAnsi="Consolas"/>
                 <w:sz w:val="18"/>
               </w:rPr>
               <w:t>05</w:t>
@@ -11638,7 +11590,6 @@
             <w:r>
               <w:rPr>
                 <w:b w:val="0"/>
-                <w:rFonts w:ascii="Consolas" w:hAnsi="Consolas"/>
                 <w:sz w:val="18"/>
               </w:rPr>
               <w:t>dados/preparados/faixas_preparadas.csv</w:t>
@@ -11701,7 +11652,6 @@
             <w:r>
               <w:rPr>
                 <w:b w:val="0"/>
-                <w:rFonts w:ascii="Consolas" w:hAnsi="Consolas"/>
                 <w:sz w:val="18"/>
               </w:rPr>
               <w:t>README.md</w:t>
@@ -11716,7 +11666,6 @@
             <w:r>
               <w:rPr>
                 <w:b w:val="0"/>
-                <w:rFonts w:ascii="Consolas" w:hAnsi="Consolas"/>
                 <w:sz w:val="18"/>
               </w:rPr>
               <w:t>documentacao/ra1/</w:t>
@@ -11731,7 +11680,6 @@
             <w:r>
               <w:rPr>
                 <w:b w:val="0"/>
-                <w:rFonts w:ascii="Consolas" w:hAnsi="Consolas"/>
                 <w:sz w:val="18"/>
               </w:rPr>
               <w:t>python scripts/gerar_docx_ra1.py</w:t>
@@ -11746,7 +11694,6 @@
             <w:r>
               <w:rPr>
                 <w:b w:val="0"/>
-                <w:rFonts w:ascii="Consolas" w:hAnsi="Consolas"/>
                 <w:sz w:val="18"/>
               </w:rPr>
               <w:t>dados/README.md</w:t>
@@ -11761,7 +11708,6 @@
             <w:r>
               <w:rPr>
                 <w:b w:val="0"/>
-                <w:rFonts w:ascii="Consolas" w:hAnsi="Consolas"/>
                 <w:sz w:val="18"/>
               </w:rPr>
               <w:t>requirements.txt</w:t>
@@ -11776,7 +11722,6 @@
             <w:r>
               <w:rPr>
                 <w:b w:val="0"/>
-                <w:rFonts w:ascii="Consolas" w:hAnsi="Consolas"/>
                 <w:sz w:val="18"/>
               </w:rPr>
               <w:t>docs/adr/</w:t>
@@ -11811,20 +11756,12 @@
         <w:t>A reprodução não depende da API (fora do ar, bloqueada ou com outro chart conforme o país e o dia): o notebook lê por padrão o retrato versionado de 16/10/2026, base dos números deste documento. Uma coleta nova (</w:t>
       </w:r>
       <w:r>
-        <w:rPr>
-          <w:rFonts w:ascii="Consolas" w:hAnsi="Consolas"/>
-          <w:sz w:val="18"/>
-        </w:rPr>
         <w:t>BAIXAR_DA_API = True</w:t>
       </w:r>
       <w:r>
         <w:t xml:space="preserve">) grava outra pasta em </w:t>
       </w:r>
       <w:r>
-        <w:rPr>
-          <w:rFonts w:ascii="Consolas" w:hAnsi="Consolas"/>
-          <w:sz w:val="18"/>
-        </w:rPr>
         <w:t>dados/brutos/</w:t>
       </w:r>
       <w:r>
@@ -12005,7 +11942,6 @@
             <w:r>
               <w:rPr>
                 <w:b w:val="0"/>
-                <w:rFonts w:ascii="Consolas" w:hAnsi="Consolas"/>
                 <w:sz w:val="18"/>
               </w:rPr>
               <w:t>Jcliz/data-analytics</w:t>
@@ -12020,7 +11956,6 @@
             <w:r>
               <w:rPr>
                 <w:b w:val="0"/>
-                <w:rFonts w:ascii="Consolas" w:hAnsi="Consolas"/>
                 <w:sz w:val="18"/>
               </w:rPr>
               <w:t>notebook/projeto_data_analytics.ipynb</w:t>
@@ -12035,7 +11970,6 @@
             <w:r>
               <w:rPr>
                 <w:b w:val="0"/>
-                <w:rFonts w:ascii="Consolas" w:hAnsi="Consolas"/>
                 <w:sz w:val="18"/>
               </w:rPr>
               <w:t>git clone https://github.com/Jcliz/data-analytics.git</w:t>
@@ -12050,7 +11984,6 @@
             <w:r>
               <w:rPr>
                 <w:b w:val="0"/>
-                <w:rFonts w:ascii="Consolas" w:hAnsi="Consolas"/>
                 <w:sz w:val="18"/>
               </w:rPr>
               <w:t>cd data-analytics</w:t>
@@ -12065,7 +11998,6 @@
             <w:r>
               <w:rPr>
                 <w:b w:val="0"/>
-                <w:rFonts w:ascii="Consolas" w:hAnsi="Consolas"/>
                 <w:sz w:val="18"/>
               </w:rPr>
               <w:t>python -m venv .venv</w:t>
@@ -12080,7 +12012,6 @@
             <w:r>
               <w:rPr>
                 <w:b w:val="0"/>
-                <w:rFonts w:ascii="Consolas" w:hAnsi="Consolas"/>
                 <w:sz w:val="18"/>
               </w:rPr>
               <w:t>pip install -r requirements.txt</w:t>
@@ -12113,7 +12044,6 @@
             <w:r>
               <w:rPr>
                 <w:b w:val="0"/>
-                <w:rFonts w:ascii="Consolas" w:hAnsi="Consolas"/>
                 <w:sz w:val="18"/>
               </w:rPr>
               <w:t>pip</w:t>
@@ -12128,7 +12058,6 @@
             <w:r>
               <w:rPr>
                 <w:b w:val="0"/>
-                <w:rFonts w:ascii="Consolas" w:hAnsi="Consolas"/>
                 <w:sz w:val="18"/>
               </w:rPr>
               <w:t>python -c "import pandas, requests"</w:t>
@@ -12198,7 +12127,6 @@
             <w:r>
               <w:rPr>
                 <w:b w:val="0"/>
-                <w:rFonts w:ascii="Consolas" w:hAnsi="Consolas"/>
                 <w:sz w:val="18"/>
               </w:rPr>
               <w:t>BAIXAR_DA_API = False</w:t>
@@ -12213,7 +12141,6 @@
             <w:r>
               <w:rPr>
                 <w:b w:val="0"/>
-                <w:rFonts w:ascii="Consolas" w:hAnsi="Consolas"/>
                 <w:sz w:val="18"/>
               </w:rPr>
               <w:t>dados/brutos/</w:t>
@@ -12246,7 +12173,6 @@
             <w:r>
               <w:rPr>
                 <w:b w:val="0"/>
-                <w:rFonts w:ascii="Consolas" w:hAnsi="Consolas"/>
                 <w:sz w:val="18"/>
               </w:rPr>
               <w:t>dados/brutos/2026-10-16</w:t>
@@ -12331,7 +12257,6 @@
             <w:r>
               <w:rPr>
                 <w:b w:val="0"/>
-                <w:rFonts w:ascii="Consolas" w:hAnsi="Consolas"/>
                 <w:sz w:val="18"/>
               </w:rPr>
               <w:t>python scripts/montar_notebook.py</w:t>
@@ -12346,7 +12271,6 @@
             <w:r>
               <w:rPr>
                 <w:b w:val="0"/>
-                <w:rFonts w:ascii="Consolas" w:hAnsi="Consolas"/>
                 <w:sz w:val="18"/>
               </w:rPr>
               <w:t>jupyter nbconvert --to notebook --execute --inplace notebook/projeto_data_analytics.ipynb</w:t>
@@ -12379,7 +12303,6 @@
             <w:r>
               <w:rPr>
                 <w:b w:val="0"/>
-                <w:rFonts w:ascii="Consolas" w:hAnsi="Consolas"/>
                 <w:sz w:val="18"/>
               </w:rPr>
               <w:t>df_bruto: 2800 linhas × 102 colunas</w:t>
@@ -12449,7 +12372,6 @@
             <w:r>
               <w:rPr>
                 <w:b w:val="0"/>
-                <w:rFonts w:ascii="Consolas" w:hAnsi="Consolas"/>
                 <w:sz w:val="18"/>
               </w:rPr>
               <w:t>python scripts/verificar_entrega.py</w:t>
@@ -12475,7 +12397,6 @@
             <w:r>
               <w:rPr>
                 <w:b w:val="0"/>
-                <w:rFonts w:ascii="Consolas" w:hAnsi="Consolas"/>
                 <w:sz w:val="18"/>
               </w:rPr>
               <w:t>dados/preparados/faixas_preparadas.csv</w:t>
@@ -12505,54 +12426,45 @@
         <w:t xml:space="preserve">Em 20/10/2026, João Correa, que não escreveu o código das seções, seguiu os quatro passos acima a partir de um clone limpo: ambiente novo com </w:t>
       </w:r>
       <w:r>
-        <w:rPr>
-          <w:rFonts w:ascii="Consolas" w:hAnsi="Consolas"/>
-          <w:sz w:val="18"/>
-        </w:rPr>
         <w:t>pip install -r requirements.txt</w:t>
       </w:r>
       <w:r>
         <w:t xml:space="preserve"> e execução com </w:t>
       </w:r>
       <w:r>
-        <w:rPr>
-          <w:rFonts w:ascii="Consolas" w:hAnsi="Consolas"/>
-          <w:sz w:val="18"/>
-        </w:rPr>
         <w:t>jupyter nbconvert --execute</w:t>
       </w:r>
       <w:r>
         <w:t xml:space="preserve">, em Linux (WSL2), Python 3.13.5, pandas 2.3.3, requests 2.34.2, PySpark 4.0.3 e Java 21. Resultado: 47 células de código em sequência, sem erro, em 14 s; </w:t>
       </w:r>
       <w:r>
-        <w:rPr>
-          <w:rFonts w:ascii="Consolas" w:hAnsi="Consolas"/>
-          <w:sz w:val="18"/>
-        </w:rPr>
         <w:t>df_bruto</w:t>
       </w:r>
       <w:r>
         <w:t xml:space="preserve"> com 2.800 linhas × 102 colunas; </w:t>
       </w:r>
       <w:r>
-        <w:rPr>
-          <w:rFonts w:ascii="Consolas" w:hAnsi="Consolas"/>
-          <w:sz w:val="18"/>
-        </w:rPr>
         <w:t>dados/preparados/faixas_preparadas.csv</w:t>
       </w:r>
       <w:r>
         <w:t xml:space="preserve"> regravado idêntico ao versionado; três lotes de 30 eventos processados (90 reproduções); </w:t>
       </w:r>
       <w:r>
-        <w:rPr>
-          <w:rFonts w:ascii="Consolas" w:hAnsi="Consolas"/>
-          <w:sz w:val="18"/>
-        </w:rPr>
         <w:t>python scripts/verificar_entrega.py</w:t>
       </w:r>
       <w:r>
         <w:t xml:space="preserve"> sem pendência no notebook.</w:t>
+      </w:r>
+    </w:p>
+    <w:p>
+      <w:pPr>
+        <w:spacing w:after="80"/>
+        <w:pBdr>
+          <w:bottom w:val="single" w:sz="3" w:color="E2E2E2"/>
+        </w:pBdr>
+      </w:pPr>
+      <w:r>
+        <w:t xml:space="preserve"> </w:t>
       </w:r>
     </w:p>
     <w:p>
@@ -12604,60 +12516,36 @@
         <w:t>: documentação e API pública (</w:t>
       </w:r>
       <w:r>
-        <w:rPr>
-          <w:rFonts w:ascii="Consolas" w:hAnsi="Consolas"/>
-          <w:sz w:val="18"/>
-        </w:rPr>
         <w:t>/infos</w:t>
       </w:r>
       <w:r>
         <w:t xml:space="preserve">, </w:t>
       </w:r>
       <w:r>
-        <w:rPr>
-          <w:rFonts w:ascii="Consolas" w:hAnsi="Consolas"/>
-          <w:sz w:val="18"/>
-        </w:rPr>
         <w:t>/genre</w:t>
       </w:r>
       <w:r>
         <w:t xml:space="preserve">, </w:t>
       </w:r>
       <w:r>
-        <w:rPr>
-          <w:rFonts w:ascii="Consolas" w:hAnsi="Consolas"/>
-          <w:sz w:val="18"/>
-        </w:rPr>
         <w:t>/chart/{id}/tracks</w:t>
       </w:r>
       <w:r>
         <w:t xml:space="preserve">, </w:t>
       </w:r>
       <w:r>
-        <w:rPr>
-          <w:rFonts w:ascii="Consolas" w:hAnsi="Consolas"/>
-          <w:sz w:val="18"/>
-        </w:rPr>
         <w:t>/track/{id}</w:t>
       </w:r>
       <w:r>
         <w:t xml:space="preserve">, </w:t>
       </w:r>
       <w:r>
-        <w:rPr>
-          <w:rFonts w:ascii="Consolas" w:hAnsi="Consolas"/>
-          <w:sz w:val="18"/>
-        </w:rPr>
         <w:t>/album/{id}</w:t>
       </w:r>
       <w:r>
         <w:t xml:space="preserve">, </w:t>
       </w:r>
       <w:r>
-        <w:rPr>
-          <w:rFonts w:ascii="Consolas" w:hAnsi="Consolas"/>
-          <w:sz w:val="18"/>
-        </w:rPr>
         <w:t>/artist/{id}</w:t>
       </w:r>
       <w:r>
@@ -12966,7 +12854,6 @@
             <w:r>
               <w:rPr>
                 <w:b w:val="0"/>
-                <w:rFonts w:ascii="Consolas" w:hAnsi="Consolas"/>
                 <w:sz w:val="18"/>
               </w:rPr>
               <w:t>dados/preparados/dicionario-faixas.md</w:t>
@@ -13047,7 +12934,6 @@
             <w:r>
               <w:rPr>
                 <w:b w:val="0"/>
-                <w:rFonts w:ascii="Consolas" w:hAnsi="Consolas"/>
                 <w:sz w:val="18"/>
               </w:rPr>
               <w:t>dados/brutos/2026-10-16/metadados.json</w:t>

</xml_diff>

<commit_message>
ra1(documento): aponta o repositório da entrega eduardofabrii/data-analytics-ras (#14)
Capa e seção 06 passam a citar o repositório da entrega, o notebook
notebook/ra1-ra2-deezer.ipynb e os arquivos que existem nele (README,
dicionário e requirements.txt), sem os scripts do repositório de
desenvolvimento. A seção 06 registra a nova execução a partir de um clone
limpo em 21/10/2026, e a seção 01 deixa de citar um arquivo que não vai no
repositório da entrega.
</commit_message>
<xml_diff>
--- a/output/ra1-documentacao.docx
+++ b/output/ra1-documentacao.docx
@@ -138,7 +138,7 @@
       </w:r>
       <w:r>
         <w:rPr/>
-        <w:t>https://github.com/Jcliz/data-analytics</w:t>
+        <w:t>https://github.com/eduardofabrii/data-analytics-ras</w:t>
       </w:r>
     </w:p>
     <w:p>
@@ -956,13 +956,7 @@
         <w:t>/genre</w:t>
       </w:r>
       <w:r>
-        <w:t xml:space="preserve"> (fontes 1 e 2; </w:t>
-      </w:r>
-      <w:r>
-        <w:t>base/api-deezer.md</w:t>
-      </w:r>
-      <w:r>
-        <w:t>, seções 2 e 3). Coletar cada chart de gênero registra o gênero de origem em cada item, sem depender do gênero do álbum.</w:t>
+        <w:t xml:space="preserve"> (fontes 1 e 2). Coletar cada chart de gênero registra o gênero de origem em cada item, sem depender do gênero do álbum.</w:t>
       </w:r>
     </w:p>
     <w:p>
@@ -11081,23 +11075,15 @@
       </w:r>
       <w:r>
         <w:rPr/>
-        <w:t xml:space="preserve">https://github.com/Jcliz/data-analytics • tag </w:t>
+        <w:t xml:space="preserve">https://github.com/eduardofabrii/data-analytics-ras • ramo </w:t>
       </w:r>
       <w:r>
         <w:rPr/>
-        <w:t>entrega</w:t>
+        <w:t>main</w:t>
       </w:r>
       <w:r>
         <w:rPr/>
-        <w:t xml:space="preserve">, no commit da execução final (o PDF entregue fica em </w:t>
-      </w:r>
-      <w:r>
-        <w:rPr/>
-        <w:t>output/entrega-ra1-ra2.pdf</w:t>
-      </w:r>
-      <w:r>
-        <w:rPr/>
-        <w:t xml:space="preserve"> nessa tag)</w:t>
+        <w:t>, com o notebook executado, os dados brutos e preparados e as dependências</w:t>
       </w:r>
     </w:p>
     <w:p>
@@ -11120,7 +11106,7 @@
       </w:r>
       <w:r>
         <w:rPr/>
-        <w:t>: pandas 2.2 a 2.x e requests 2.31 ou mais novo (RA1), pyspark 4.0.3 com Java 17 ou mais novo (RA2), jupyter, nbconvert, python-docx e pypdf (notebook e PDFs) • conferidas em 16/10/2026 numa instalação limpa: Python 3.13.16, pandas 2.3.3, requests 2.34.2, pyspark 4.0.3, nbconvert 7.17.2, python-docx 1.2.0 e pypdf 6.21.0</w:t>
+        <w:t>: pandas 2.2 a 2.x e requests 2.31 ou mais novo (RA1), pyspark 4.0.3 com Java 17 ou mais novo (RA2), jupyter e nbconvert (execução do notebook) • conferidas em 16/10/2026 numa instalação limpa: Python 3.13.16, pandas 2.3.3, requests 2.34.2, pyspark 4.0.3, nbconvert 7.17.2, python-docx 1.2.0 e pypdf 6.21.0</w:t>
       </w:r>
     </w:p>
     <w:p>
@@ -11377,7 +11363,7 @@
                 <w:b w:val="0"/>
                 <w:sz w:val="18"/>
               </w:rPr>
-              <w:t xml:space="preserve"> na seção 00b</w:t>
+              <w:t xml:space="preserve"> na célula "Preparação do ambiente"</w:t>
             </w:r>
           </w:p>
         </w:tc>
@@ -11432,112 +11418,14 @@
                 <w:b w:val="0"/>
                 <w:sz w:val="18"/>
               </w:rPr>
-              <w:t>notebook/projeto_data_analytics.ipynb</w:t>
-            </w:r>
-            <w:r>
-              <w:rPr>
-                <w:b w:val="0"/>
-                <w:sz w:val="18"/>
-              </w:rPr>
-              <w:t xml:space="preserve">, gerado por </w:t>
-            </w:r>
-            <w:r>
-              <w:rPr>
-                <w:b w:val="0"/>
-                <w:sz w:val="18"/>
-              </w:rPr>
-              <w:t>python scripts/montar_notebook.py</w:t>
-            </w:r>
-            <w:r>
-              <w:rPr>
-                <w:b w:val="0"/>
-                <w:sz w:val="18"/>
-              </w:rPr>
-              <w:t xml:space="preserve"> a partir de </w:t>
-            </w:r>
-            <w:r>
-              <w:rPr>
-                <w:b w:val="0"/>
-                <w:sz w:val="18"/>
-              </w:rPr>
-              <w:t>notebook/secoes/</w:t>
-            </w:r>
-            <w:r>
-              <w:rPr>
-                <w:b w:val="0"/>
-                <w:sz w:val="18"/>
-              </w:rPr>
-              <w:t xml:space="preserve"> (ambiente em </w:t>
-            </w:r>
-            <w:r>
-              <w:rPr>
-                <w:b w:val="0"/>
-                <w:sz w:val="18"/>
-              </w:rPr>
-              <w:t>00b</w:t>
-            </w:r>
-            <w:r>
-              <w:rPr>
-                <w:b w:val="0"/>
-                <w:sz w:val="18"/>
-              </w:rPr>
-              <w:t xml:space="preserve">, ingestão em </w:t>
-            </w:r>
-            <w:r>
-              <w:rPr>
-                <w:b w:val="0"/>
-                <w:sz w:val="18"/>
-              </w:rPr>
-              <w:t>02</w:t>
-            </w:r>
-            <w:r>
-              <w:rPr>
-                <w:b w:val="0"/>
-                <w:sz w:val="18"/>
-              </w:rPr>
-              <w:t xml:space="preserve">, exploração em </w:t>
-            </w:r>
-            <w:r>
-              <w:rPr>
-                <w:b w:val="0"/>
-                <w:sz w:val="18"/>
-              </w:rPr>
-              <w:t>03</w:t>
-            </w:r>
-            <w:r>
-              <w:rPr>
-                <w:b w:val="0"/>
-                <w:sz w:val="18"/>
-              </w:rPr>
-              <w:t xml:space="preserve">, limpeza em </w:t>
-            </w:r>
-            <w:r>
-              <w:rPr>
-                <w:b w:val="0"/>
-                <w:sz w:val="18"/>
-              </w:rPr>
-              <w:t>04</w:t>
-            </w:r>
-            <w:r>
-              <w:rPr>
-                <w:b w:val="0"/>
-                <w:sz w:val="18"/>
-              </w:rPr>
-              <w:t xml:space="preserve">, transformação em </w:t>
-            </w:r>
-            <w:r>
-              <w:rPr>
-                <w:b w:val="0"/>
-                <w:sz w:val="18"/>
-              </w:rPr>
-              <w:t>05</w:t>
-            </w:r>
-            <w:r>
-              <w:rPr>
-                <w:b w:val="0"/>
-                <w:sz w:val="18"/>
-              </w:rPr>
-              <w:t>)</w:t>
+              <w:t>notebook/ra1-ra2-deezer.ipynb</w:t>
+            </w:r>
+            <w:r>
+              <w:rPr>
+                <w:b w:val="0"/>
+                <w:sz w:val="18"/>
+              </w:rPr>
+              <w:t>, já executado e com as saídas salvas (ambiente na célula "Preparação do ambiente", ingestão na seção 2, exploração na 3, limpeza na 4 e transformação na 5)</w:t>
             </w:r>
           </w:p>
         </w:tc>
@@ -11599,7 +11487,14 @@
                 <w:b w:val="0"/>
                 <w:sz w:val="18"/>
               </w:rPr>
-              <w:t xml:space="preserve"> (UTF-8, separador vírgula), regravado pelas seções 04 e 05 a cada execução; nunca editado à mão</w:t>
+              <w:t xml:space="preserve"> (UTF-8, separador vírgula), regravado pelas seções 4 e 5 a cada execução; nunca editado à mão. Colunas descritas em </w:t>
+            </w:r>
+            <w:r>
+              <w:rPr>
+                <w:b w:val="0"/>
+                <w:sz w:val="18"/>
+              </w:rPr>
+              <w:t>dados/preparados/dicionario-faixas.md</w:t>
             </w:r>
           </w:p>
         </w:tc>
@@ -11661,49 +11556,21 @@
                 <w:b w:val="0"/>
                 <w:sz w:val="18"/>
               </w:rPr>
-              <w:t xml:space="preserve"> (seção "Como executar"), este documento em </w:t>
-            </w:r>
-            <w:r>
-              <w:rPr>
-                <w:b w:val="0"/>
-                <w:sz w:val="18"/>
-              </w:rPr>
-              <w:t>documentacao/ra1/</w:t>
-            </w:r>
-            <w:r>
-              <w:rPr>
-                <w:b w:val="0"/>
-                <w:sz w:val="18"/>
-              </w:rPr>
-              <w:t xml:space="preserve"> (gerado por </w:t>
-            </w:r>
-            <w:r>
-              <w:rPr>
-                <w:b w:val="0"/>
-                <w:sz w:val="18"/>
-              </w:rPr>
-              <w:t>python scripts/gerar_docx_ra1.py</w:t>
-            </w:r>
-            <w:r>
-              <w:rPr>
-                <w:b w:val="0"/>
-                <w:sz w:val="18"/>
-              </w:rPr>
-              <w:t xml:space="preserve">), </w:t>
-            </w:r>
-            <w:r>
-              <w:rPr>
-                <w:b w:val="0"/>
-                <w:sz w:val="18"/>
-              </w:rPr>
-              <w:t>dados/README.md</w:t>
-            </w:r>
-            <w:r>
-              <w:rPr>
-                <w:b w:val="0"/>
-                <w:sz w:val="18"/>
-              </w:rPr>
-              <w:t xml:space="preserve">, </w:t>
+              <w:t xml:space="preserve"> (seções "Execução no Google Colab", "Execução local" e "Dados e resultados esperados"), </w:t>
+            </w:r>
+            <w:r>
+              <w:rPr>
+                <w:b w:val="0"/>
+                <w:sz w:val="18"/>
+              </w:rPr>
+              <w:t>dados/preparados/dicionario-faixas.md</w:t>
+            </w:r>
+            <w:r>
+              <w:rPr>
+                <w:b w:val="0"/>
+                <w:sz w:val="18"/>
+              </w:rPr>
+              <w:t xml:space="preserve"> e </w:t>
             </w:r>
             <w:r>
               <w:rPr>
@@ -11711,27 +11578,6 @@
                 <w:sz w:val="18"/>
               </w:rPr>
               <w:t>requirements.txt</w:t>
-            </w:r>
-            <w:r>
-              <w:rPr>
-                <w:b w:val="0"/>
-                <w:sz w:val="18"/>
-              </w:rPr>
-              <w:t xml:space="preserve"> e </w:t>
-            </w:r>
-            <w:r>
-              <w:rPr>
-                <w:b w:val="0"/>
-                <w:sz w:val="18"/>
-              </w:rPr>
-              <w:t>docs/adr/</w:t>
-            </w:r>
-            <w:r>
-              <w:rPr>
-                <w:b w:val="0"/>
-                <w:sz w:val="18"/>
-              </w:rPr>
-              <w:t xml:space="preserve"> (decisões)</w:t>
             </w:r>
           </w:p>
         </w:tc>
@@ -11944,7 +11790,7 @@
                 <w:b w:val="0"/>
                 <w:sz w:val="18"/>
               </w:rPr>
-              <w:t>Jcliz/data-analytics</w:t>
+              <w:t>eduardofabrii/data-analytics-ras</w:t>
             </w:r>
             <w:r>
               <w:rPr>
@@ -11958,7 +11804,7 @@
                 <w:b w:val="0"/>
                 <w:sz w:val="18"/>
               </w:rPr>
-              <w:t>notebook/projeto_data_analytics.ipynb</w:t>
+              <w:t>notebook/ra1-ra2-deezer.ipynb</w:t>
             </w:r>
             <w:r>
               <w:rPr>
@@ -11972,7 +11818,7 @@
                 <w:b w:val="0"/>
                 <w:sz w:val="18"/>
               </w:rPr>
-              <w:t>git clone https://github.com/Jcliz/data-analytics.git</w:t>
+              <w:t>git clone https://github.com/eduardofabrii/data-analytics-ras.git</w:t>
             </w:r>
             <w:r>
               <w:rPr>
@@ -11986,7 +11832,7 @@
                 <w:b w:val="0"/>
                 <w:sz w:val="18"/>
               </w:rPr>
-              <w:t>cd data-analytics</w:t>
+              <w:t>cd data-analytics-ras</w:t>
             </w:r>
             <w:r>
               <w:rPr>
@@ -12122,7 +11968,7 @@
                 <w:b w:val="0"/>
                 <w:sz w:val="18"/>
               </w:rPr>
-              <w:t xml:space="preserve">Obter os dados, sem acessar a API: a seção 00b clona o repositório no Colab com </w:t>
+              <w:t xml:space="preserve">Obter os dados, sem acessar a API: a célula "Preparação do ambiente" clona o repositório no Colab com </w:t>
             </w:r>
             <w:r>
               <w:rPr>
@@ -12136,7 +11982,7 @@
                 <w:b w:val="0"/>
                 <w:sz w:val="18"/>
               </w:rPr>
-              <w:t xml:space="preserve">, e a seção 02 lê o retrato versionado em </w:t>
+              <w:t xml:space="preserve">, e a seção 2 lê o retrato versionado em </w:t>
             </w:r>
             <w:r>
               <w:rPr>
@@ -12259,21 +12105,21 @@
                 <w:b w:val="0"/>
                 <w:sz w:val="18"/>
               </w:rPr>
-              <w:t>python scripts/montar_notebook.py</w:t>
-            </w:r>
-            <w:r>
-              <w:rPr>
-                <w:b w:val="0"/>
-                <w:sz w:val="18"/>
-              </w:rPr>
-              <w:t xml:space="preserve"> e </w:t>
-            </w:r>
-            <w:r>
-              <w:rPr>
-                <w:b w:val="0"/>
-                <w:sz w:val="18"/>
-              </w:rPr>
-              <w:t>jupyter nbconvert --to notebook --execute --inplace notebook/projeto_data_analytics.ipynb</w:t>
+              <w:t>python -m jupyter notebook notebook/ra1-ra2-deezer.ipynb</w:t>
+            </w:r>
+            <w:r>
+              <w:rPr>
+                <w:b w:val="0"/>
+                <w:sz w:val="18"/>
+              </w:rPr>
+              <w:t xml:space="preserve"> e executar todas as células na ordem, ou </w:t>
+            </w:r>
+            <w:r>
+              <w:rPr>
+                <w:b w:val="0"/>
+                <w:sz w:val="18"/>
+              </w:rPr>
+              <w:t>jupyter nbconvert --to notebook --execute --inplace notebook/ra1-ra2-deezer.ipynb</w:t>
             </w:r>
           </w:p>
         </w:tc>
@@ -12367,14 +12213,7 @@
                 <w:b w:val="0"/>
                 <w:sz w:val="18"/>
               </w:rPr>
-              <w:t xml:space="preserve">Validar a saída: conferir o conjunto preparado e rodar </w:t>
-            </w:r>
-            <w:r>
-              <w:rPr>
-                <w:b w:val="0"/>
-                <w:sz w:val="18"/>
-              </w:rPr>
-              <w:t>python scripts/verificar_entrega.py</w:t>
+              <w:t>Validar a saída: conferir o conjunto preparado e as contagens do RA2</w:t>
             </w:r>
           </w:p>
         </w:tc>
@@ -12406,7 +12245,7 @@
                 <w:b w:val="0"/>
                 <w:sz w:val="18"/>
               </w:rPr>
-              <w:t xml:space="preserve"> regravado (seção 05); script sem pendência de notebook desatualizado ou não executado</w:t>
+              <w:t xml:space="preserve"> regravado com 2.800 linhas e 16 colunas (seção 5, célula "Gravação e releitura do conjunto preparado"); na seção 11, totais de 30, 60 e 90 reproduções simuladas</w:t>
             </w:r>
           </w:p>
         </w:tc>
@@ -12423,7 +12262,7 @@
     <w:p>
       <w:pPr/>
       <w:r>
-        <w:t xml:space="preserve">Em 20/10/2026, João Correa, que não escreveu o código das seções, seguiu os quatro passos acima a partir de um clone limpo: ambiente novo com </w:t>
+        <w:t xml:space="preserve">Em 20/10/2026, João Correa, que não escreveu o código das seções, executou o notebook a partir de um clone limpo: ambiente novo com </w:t>
       </w:r>
       <w:r>
         <w:t>pip install -r requirements.txt</w:t>
@@ -12447,13 +12286,13 @@
         <w:t>dados/preparados/faixas_preparadas.csv</w:t>
       </w:r>
       <w:r>
-        <w:t xml:space="preserve"> regravado idêntico ao versionado; três lotes de 30 eventos processados (90 reproduções); </w:t>
-      </w:r>
-      <w:r>
-        <w:t>python scripts/verificar_entrega.py</w:t>
-      </w:r>
-      <w:r>
-        <w:t xml:space="preserve"> sem pendência no notebook.</w:t>
+        <w:t xml:space="preserve"> regravado idêntico ao versionado; três lotes de 30 eventos processados (90 reproduções). Em 21/10/2026, o repositório da entrega foi executado de novo do mesmo modo, a partir de um clone limpo, em Linux com Python 3.13.16, pandas 2.3.3 e PySpark 4.0.3: as mesmas 47 células de código sem erro, </w:t>
+      </w:r>
+      <w:r>
+        <w:t>df_bruto</w:t>
+      </w:r>
+      <w:r>
+        <w:t xml:space="preserve"> com 2.800 linhas × 102 colunas e o CSV preparado idêntico ao versionado.</w:t>
       </w:r>
     </w:p>
     <w:p>

</xml_diff>

<commit_message>
geral(notebook): segue a estrutura do template do professor e clona o repositório da entrega (#14)
- A preparação do ambiente deixa de ser uma célula extra antes do RA1 e vira a primeira célula
  de código da seção 2; o clone no Colab passa a ser o eduardofabrii/data-analytics-ras e a raiz
  é achada pelo requirements.txt e por dados/brutos, sem depender do CONTEXT.md.
- Identificação com o campo Turma do template (curso e período, como na capa do documento).
- Seções 3, 4 e 5: o texto do grupo sai da célula do enunciado e entra na resposta.
- Seção 11: a célula de encerramento vem antes da resposta, com a orientação da demonstração ao
  vivo como comentário, na ordem do template (código e depois resposta).
- Sem link para ADR no texto entregue. Notebook executado de novo (47 células, sem erro, CSV
  idêntico), PDF do notebook e documento do RA1 gerados de novo.
</commit_message>
<xml_diff>
--- a/output/ra1-documentacao.docx
+++ b/output/ra1-documentacao.docx
@@ -11363,7 +11363,7 @@
                 <w:b w:val="0"/>
                 <w:sz w:val="18"/>
               </w:rPr>
-              <w:t xml:space="preserve"> na célula "Preparação do ambiente"</w:t>
+              <w:t xml:space="preserve"> na célula "Preparação do ambiente" (primeira célula de código da seção 2)</w:t>
             </w:r>
           </w:p>
         </w:tc>
@@ -11425,7 +11425,7 @@
                 <w:b w:val="0"/>
                 <w:sz w:val="18"/>
               </w:rPr>
-              <w:t>, já executado e com as saídas salvas (ambiente na célula "Preparação do ambiente", ingestão na seção 2, exploração na 3, limpeza na 4 e transformação na 5)</w:t>
+              <w:t>, já executado e com as saídas salvas (ambiente e ingestão na seção 2, a partir da célula "Preparação do ambiente", exploração na 3, limpeza na 4 e transformação na 5)</w:t>
             </w:r>
           </w:p>
         </w:tc>
@@ -11968,7 +11968,7 @@
                 <w:b w:val="0"/>
                 <w:sz w:val="18"/>
               </w:rPr>
-              <w:t xml:space="preserve">Obter os dados, sem acessar a API: a célula "Preparação do ambiente" clona o repositório no Colab com </w:t>
+              <w:t xml:space="preserve">Obter os dados, sem acessar a API: a célula "Preparação do ambiente", na seção 2, clona o repositório no Colab com </w:t>
             </w:r>
             <w:r>
               <w:rPr>
@@ -11982,7 +11982,7 @@
                 <w:b w:val="0"/>
                 <w:sz w:val="18"/>
               </w:rPr>
-              <w:t xml:space="preserve">, e a seção 2 lê o retrato versionado em </w:t>
+              <w:t xml:space="preserve">, e as células seguintes leem o retrato versionado em </w:t>
             </w:r>
             <w:r>
               <w:rPr>

</xml_diff>